<commit_message>
docs: add Project Charter and Stakeholders Register modal to Slide 8, fully translated, matching curriculum outline
</commit_message>
<xml_diff>
--- a/Seminar/Report.docx
+++ b/Seminar/Report.docx
@@ -3890,6 +3890,10 @@
     <w:p>
       <w:pPr>
         <w:pStyle w:val="Heading2"/>
+        <w:numPr>
+          <w:ilvl w:val="0"/>
+          <w:numId w:val="0"/>
+        </w:numPr>
       </w:pPr>
       <w:bookmarkStart w:id="2" w:name="_Toc236148893"/>
       <w:r>
@@ -3984,6 +3988,10 @@
     <w:p>
       <w:pPr>
         <w:pStyle w:val="Heading2"/>
+        <w:numPr>
+          <w:ilvl w:val="0"/>
+          <w:numId w:val="0"/>
+        </w:numPr>
       </w:pPr>
       <w:bookmarkStart w:id="3" w:name="_Toc236148894"/>
       <w:r>
@@ -4078,6 +4086,10 @@
     <w:p>
       <w:pPr>
         <w:pStyle w:val="Heading2"/>
+        <w:numPr>
+          <w:ilvl w:val="0"/>
+          <w:numId w:val="0"/>
+        </w:numPr>
       </w:pPr>
       <w:bookmarkStart w:id="4" w:name="_Toc236148895"/>
       <w:r>
@@ -4173,6 +4185,10 @@
     <w:p>
       <w:pPr>
         <w:pStyle w:val="Heading2"/>
+        <w:numPr>
+          <w:ilvl w:val="0"/>
+          <w:numId w:val="0"/>
+        </w:numPr>
       </w:pPr>
       <w:bookmarkStart w:id="5" w:name="_Toc236148896"/>
       <w:r>
@@ -4291,6 +4307,10 @@
     <w:p>
       <w:pPr>
         <w:pStyle w:val="Heading2"/>
+        <w:numPr>
+          <w:ilvl w:val="0"/>
+          <w:numId w:val="0"/>
+        </w:numPr>
       </w:pPr>
       <w:bookmarkStart w:id="6" w:name="_Toc236148897"/>
       <w:r>
@@ -4700,6 +4720,10 @@
     <w:p>
       <w:pPr>
         <w:pStyle w:val="Heading2"/>
+        <w:numPr>
+          <w:ilvl w:val="0"/>
+          <w:numId w:val="0"/>
+        </w:numPr>
       </w:pPr>
       <w:bookmarkStart w:id="7" w:name="_Toc236148898"/>
       <w:r>
@@ -5973,6 +5997,10 @@
     <w:p>
       <w:pPr>
         <w:pStyle w:val="Heading2"/>
+        <w:numPr>
+          <w:ilvl w:val="0"/>
+          <w:numId w:val="0"/>
+        </w:numPr>
       </w:pPr>
       <w:bookmarkStart w:id="9" w:name="_Toc236148900"/>
       <w:r>
@@ -6024,6 +6052,10 @@
     <w:p>
       <w:pPr>
         <w:pStyle w:val="Heading2"/>
+        <w:numPr>
+          <w:ilvl w:val="0"/>
+          <w:numId w:val="0"/>
+        </w:numPr>
       </w:pPr>
       <w:bookmarkStart w:id="10" w:name="_Toc236148901"/>
       <w:r>
@@ -6414,6 +6446,10 @@
     <w:p>
       <w:pPr>
         <w:pStyle w:val="Heading2"/>
+        <w:numPr>
+          <w:ilvl w:val="0"/>
+          <w:numId w:val="0"/>
+        </w:numPr>
       </w:pPr>
       <w:bookmarkStart w:id="11" w:name="_Toc236148902"/>
       <w:r>
@@ -6613,7 +6649,15 @@
         <w:spacing w:before="0" w:after="160" w:line="278" w:lineRule="auto"/>
       </w:pPr>
       <w:r>
-        <w:t>$EU(A) = U(50,000)=50,000≈223.6</w:t>
+        <w:t xml:space="preserve">$EU(A) = </w:t>
+      </w:r>
+      <w:proofErr w:type="gramStart"/>
+      <w:r>
+        <w:t>U(50,000)=</w:t>
+      </w:r>
+      <w:proofErr w:type="gramEnd"/>
+      <w:r>
+        <w:t>50,000≈223.6</w:t>
       </w:r>
     </w:p>
     <w:p>
@@ -6625,7 +6669,23 @@
         <w:spacing w:before="0" w:after="160" w:line="278" w:lineRule="auto"/>
       </w:pPr>
       <w:r>
-        <w:t>$EU(B) = 0.5 \times U($120,000) + 0.5 \times U(0)=0.5×120,000+0.5×0≈173.2</w:t>
+        <w:t xml:space="preserve">$EU(B) = 0.5 \times </w:t>
+      </w:r>
+      <w:proofErr w:type="gramStart"/>
+      <w:r>
+        <w:t>U(</w:t>
+      </w:r>
+      <w:proofErr w:type="gramEnd"/>
+      <w:r>
+        <w:t xml:space="preserve">$120,000) + 0.5 \times </w:t>
+      </w:r>
+      <w:proofErr w:type="gramStart"/>
+      <w:r>
+        <w:t>U(0)=</w:t>
+      </w:r>
+      <w:proofErr w:type="gramEnd"/>
+      <w:r>
+        <w:t>0.5×120,000+0.5×0≈173.2</w:t>
       </w:r>
     </w:p>
     <w:p>
@@ -6668,6 +6728,10 @@
     <w:p>
       <w:pPr>
         <w:pStyle w:val="Heading2"/>
+        <w:numPr>
+          <w:ilvl w:val="0"/>
+          <w:numId w:val="0"/>
+        </w:numPr>
       </w:pPr>
       <w:bookmarkStart w:id="12" w:name="_Toc236148903"/>
       <w:r>
@@ -6745,8 +6809,13 @@
         <w:t>Discount Factor:</w:t>
       </w:r>
       <w:r>
-        <w:t> DFt=1(1+r)t</w:t>
-      </w:r>
+        <w:t> DFt=1(1+</w:t>
+      </w:r>
+      <w:proofErr w:type="gramStart"/>
+      <w:r>
+        <w:t>r)t</w:t>
+      </w:r>
+      <w:proofErr w:type="gramEnd"/>
     </w:p>
     <w:p>
       <w:pPr>
@@ -6764,8 +6833,13 @@
         <w:t>Present Value of Benefits (PV_B):</w:t>
       </w:r>
       <w:r>
-        <w:t> PVB=∑t=1nBenefitt(1+r)t</w:t>
-      </w:r>
+        <w:t> PVB=∑t=1nBenefitt(1+</w:t>
+      </w:r>
+      <w:proofErr w:type="gramStart"/>
+      <w:r>
+        <w:t>r)t</w:t>
+      </w:r>
+      <w:proofErr w:type="gramEnd"/>
     </w:p>
     <w:p>
       <w:pPr>
@@ -6783,8 +6857,13 @@
         <w:t>Present Value of Costs (PV_C):</w:t>
       </w:r>
       <w:r>
-        <w:t> PVC=∑t=1nCostt(1+r)t</w:t>
-      </w:r>
+        <w:t> PVC=∑t=1nCostt(1+</w:t>
+      </w:r>
+      <w:proofErr w:type="gramStart"/>
+      <w:r>
+        <w:t>r)t</w:t>
+      </w:r>
+      <w:proofErr w:type="gramEnd"/>
     </w:p>
     <w:p>
       <w:pPr>
@@ -7109,7 +7188,39 @@
           <w:i/>
           <w:iCs/>
         </w:rPr>
-        <w:t>(Note: If calculated using nominal undiscounted ROI, Project B yields $\frac{9000 - 6000}{6000} = 50%$. Project B is the optimal option).</w:t>
+        <w:t>(Note: If calculated using nominal undiscounted ROI, Project B yields $\</w:t>
+      </w:r>
+      <w:proofErr w:type="gramStart"/>
+      <w:r>
+        <w:rPr>
+          <w:i/>
+          <w:iCs/>
+        </w:rPr>
+        <w:t>frac{</w:t>
+      </w:r>
+      <w:proofErr w:type="gramEnd"/>
+      <w:r>
+        <w:rPr>
+          <w:i/>
+          <w:iCs/>
+        </w:rPr>
+        <w:t xml:space="preserve">9000 - </w:t>
+      </w:r>
+      <w:proofErr w:type="gramStart"/>
+      <w:r>
+        <w:rPr>
+          <w:i/>
+          <w:iCs/>
+        </w:rPr>
+        <w:t>6000}{</w:t>
+      </w:r>
+      <w:proofErr w:type="gramEnd"/>
+      <w:r>
+        <w:rPr>
+          <w:i/>
+          <w:iCs/>
+        </w:rPr>
+        <w:t>6000} = 50%$. Project B is the optimal option).</w:t>
       </w:r>
     </w:p>
     <w:p>
@@ -7223,7 +7334,15 @@
         <w:t>Superior Profitability:</w:t>
       </w:r>
       <w:r>
-        <w:t> Project B's NPV ($2,161.34) is almost double that of Project A (1,102.27),whileProjectCishighlyunprofitablewithanegativeNPV(-1,343.47$).</w:t>
+        <w:t> Project B's NPV ($2,161.34) is almost double that of Project A (1,102.27</w:t>
+      </w:r>
+      <w:proofErr w:type="gramStart"/>
+      <w:r>
+        <w:t>),whileProjectCishighlyunprofitablewithanegativeNPV</w:t>
+      </w:r>
+      <w:proofErr w:type="gramEnd"/>
+      <w:r>
+        <w:t>(-1,343.47$).</w:t>
       </w:r>
     </w:p>
     <w:p>
@@ -7558,6 +7677,10 @@
     <w:p>
       <w:pPr>
         <w:pStyle w:val="Heading2"/>
+        <w:numPr>
+          <w:ilvl w:val="0"/>
+          <w:numId w:val="0"/>
+        </w:numPr>
       </w:pPr>
       <w:bookmarkStart w:id="14" w:name="_Toc236148905"/>
       <w:r>
@@ -7600,7 +7723,15 @@
         <w:t>Mitigate:</w:t>
       </w:r>
       <w:r>
-        <w:t> Take proactive actions to reduce the probability or impact of a risk below acceptable thresholds.</w:t>
+        <w:t xml:space="preserve"> Take proactive actions to reduce the probability or impact of a risk </w:t>
+      </w:r>
+      <w:proofErr w:type="gramStart"/>
+      <w:r>
+        <w:t>below acceptable thresholds</w:t>
+      </w:r>
+      <w:proofErr w:type="gramEnd"/>
+      <w:r>
+        <w:t>.</w:t>
       </w:r>
     </w:p>
     <w:p>
@@ -7644,6 +7775,10 @@
     <w:p>
       <w:pPr>
         <w:pStyle w:val="Heading2"/>
+        <w:numPr>
+          <w:ilvl w:val="0"/>
+          <w:numId w:val="0"/>
+        </w:numPr>
       </w:pPr>
       <w:bookmarkStart w:id="15" w:name="_Toc236148906"/>
       <w:r>
@@ -7730,6 +7865,10 @@
     <w:p>
       <w:pPr>
         <w:pStyle w:val="Heading2"/>
+        <w:numPr>
+          <w:ilvl w:val="0"/>
+          <w:numId w:val="0"/>
+        </w:numPr>
         <w:rPr>
           <w:b w:val="0"/>
           <w:bCs/>
@@ -8421,6 +8560,10 @@
     <w:p>
       <w:pPr>
         <w:pStyle w:val="Heading2"/>
+        <w:numPr>
+          <w:ilvl w:val="0"/>
+          <w:numId w:val="0"/>
+        </w:numPr>
       </w:pPr>
       <w:bookmarkStart w:id="17" w:name="_Toc236148908"/>
       <w:r>
@@ -8548,6 +8691,10 @@
     <w:p>
       <w:pPr>
         <w:pStyle w:val="Heading2"/>
+        <w:numPr>
+          <w:ilvl w:val="0"/>
+          <w:numId w:val="0"/>
+        </w:numPr>
       </w:pPr>
       <w:bookmarkStart w:id="19" w:name="_Toc236148910"/>
       <w:r>
@@ -8799,6 +8946,10 @@
     <w:p>
       <w:pPr>
         <w:pStyle w:val="Heading2"/>
+        <w:numPr>
+          <w:ilvl w:val="0"/>
+          <w:numId w:val="0"/>
+        </w:numPr>
         <w:rPr>
           <w:b w:val="0"/>
           <w:bCs/>
@@ -9012,6 +9163,10 @@
     <w:p>
       <w:pPr>
         <w:pStyle w:val="Heading2"/>
+        <w:numPr>
+          <w:ilvl w:val="0"/>
+          <w:numId w:val="0"/>
+        </w:numPr>
       </w:pPr>
       <w:bookmarkStart w:id="21" w:name="_Toc236148912"/>
       <w:r>
@@ -9481,6 +9636,10 @@
     <w:p>
       <w:pPr>
         <w:pStyle w:val="Heading2"/>
+        <w:numPr>
+          <w:ilvl w:val="0"/>
+          <w:numId w:val="0"/>
+        </w:numPr>
       </w:pPr>
       <w:bookmarkStart w:id="22" w:name="_Toc236148913"/>
       <w:r>
@@ -10578,6 +10737,10 @@
     <w:p>
       <w:pPr>
         <w:pStyle w:val="Heading2"/>
+        <w:numPr>
+          <w:ilvl w:val="0"/>
+          <w:numId w:val="0"/>
+        </w:numPr>
       </w:pPr>
       <w:bookmarkStart w:id="23" w:name="_Toc236148914"/>
       <w:r>
@@ -10691,6 +10854,10 @@
     <w:p>
       <w:pPr>
         <w:pStyle w:val="Heading2"/>
+        <w:numPr>
+          <w:ilvl w:val="0"/>
+          <w:numId w:val="0"/>
+        </w:numPr>
       </w:pPr>
       <w:bookmarkStart w:id="24" w:name="_Toc236148915"/>
       <w:r>
@@ -11077,6 +11244,10 @@
     <w:p>
       <w:pPr>
         <w:pStyle w:val="Heading2"/>
+        <w:numPr>
+          <w:ilvl w:val="0"/>
+          <w:numId w:val="0"/>
+        </w:numPr>
       </w:pPr>
       <w:bookmarkStart w:id="25" w:name="_Toc236148916"/>
       <w:r>
@@ -11522,6 +11693,10 @@
     <w:p>
       <w:pPr>
         <w:pStyle w:val="Heading2"/>
+        <w:numPr>
+          <w:ilvl w:val="0"/>
+          <w:numId w:val="0"/>
+        </w:numPr>
       </w:pPr>
       <w:bookmarkStart w:id="26" w:name="_Toc236148917"/>
       <w:r>
@@ -11725,6 +11900,10 @@
     <w:p>
       <w:pPr>
         <w:pStyle w:val="Heading2"/>
+        <w:numPr>
+          <w:ilvl w:val="0"/>
+          <w:numId w:val="0"/>
+        </w:numPr>
       </w:pPr>
       <w:bookmarkStart w:id="27" w:name="_Toc236148918"/>
       <w:r>
@@ -12004,6 +12183,10 @@
     <w:p>
       <w:pPr>
         <w:pStyle w:val="Heading2"/>
+        <w:numPr>
+          <w:ilvl w:val="0"/>
+          <w:numId w:val="0"/>
+        </w:numPr>
       </w:pPr>
       <w:bookmarkStart w:id="28" w:name="_Toc236148919"/>
       <w:r>
@@ -12908,16 +13091,558 @@
     </w:p>
     <w:p>
       <w:pPr>
+        <w:pStyle w:val="Heading2"/>
+        <w:numPr>
+          <w:ilvl w:val="0"/>
+          <w:numId w:val="0"/>
+        </w:numPr>
+      </w:pPr>
+      <w:r>
+        <w:t>5.11. Project Kick-off Meeting Agenda - HSU Project (Applying JWD Figure 3-2)</w:t>
+      </w:r>
+    </w:p>
+    <w:p>
+      <w:r>
+        <w:t>A formal Kick-off meeting was held on July 13, 2026, to align all stakeholders and clarify expectations. Below is the meeting agenda and action items established for the HSU Course Registration System Project:</w:t>
+      </w:r>
+    </w:p>
+    <w:p>
+      <w:r>
+        <w:t>Project Name: Online Course Registration System Construction Project</w:t>
+      </w:r>
+      <w:r>
+        <w:br/>
+        <w:t>Date of Meeting: July 13, 2026</w:t>
+      </w:r>
+      <w:r>
+        <w:br/>
+        <w:t>Meeting Objective: Get the project off to an effective start by introducing key stakeholders, reviewing project goals, and discussing future plans.</w:t>
+      </w:r>
+    </w:p>
+    <w:p>
+      <w:pPr>
+        <w:numPr>
+          <w:ilvl w:val="0"/>
+          <w:numId w:val="45"/>
+        </w:numPr>
+        <w:tabs>
+          <w:tab w:val="clear" w:pos="432"/>
+          <w:tab w:val="num" w:pos="360"/>
+        </w:tabs>
+      </w:pPr>
+      <w:r>
+        <w:t>Agenda Items:</w:t>
+      </w:r>
+    </w:p>
+    <w:p>
+      <w:pPr>
+        <w:numPr>
+          <w:ilvl w:val="0"/>
+          <w:numId w:val="133"/>
+        </w:numPr>
+      </w:pPr>
+      <w:r>
+        <w:t>Introductions of Attendees: Introductions of the project team members and HSU Academic Affairs representatives.</w:t>
+      </w:r>
+    </w:p>
+    <w:p>
+      <w:pPr>
+        <w:numPr>
+          <w:ilvl w:val="0"/>
+          <w:numId w:val="133"/>
+        </w:numPr>
+      </w:pPr>
+      <w:r>
+        <w:t>Review of the Project Background: Discussing the limitations of the legacy web portal and why a mobile application is needed.</w:t>
+      </w:r>
+    </w:p>
+    <w:p>
+      <w:pPr>
+        <w:numPr>
+          <w:ilvl w:val="0"/>
+          <w:numId w:val="133"/>
+        </w:numPr>
+      </w:pPr>
+      <w:r>
+        <w:t>Review of Project-Related Documents: Going through the drafted Business Case and Project Charter.</w:t>
+      </w:r>
+    </w:p>
+    <w:p>
+      <w:pPr>
+        <w:numPr>
+          <w:ilvl w:val="0"/>
+          <w:numId w:val="133"/>
+        </w:numPr>
+      </w:pPr>
+      <w:r>
+        <w:t>Discussion of Project Organizational Structure: Setting responsibilities (PM, Backend Dev, Frontend Dev, UI/UX).</w:t>
+      </w:r>
+    </w:p>
+    <w:p>
+      <w:pPr>
+        <w:numPr>
+          <w:ilvl w:val="0"/>
+          <w:numId w:val="133"/>
+        </w:numPr>
+      </w:pPr>
+      <w:r>
+        <w:t>Discussion of Project Scope, Time, and Cost Goals: Aligning on the 12-week schedule baseline and $150,000 budget constraint.</w:t>
+      </w:r>
+    </w:p>
+    <w:p>
+      <w:pPr>
+        <w:numPr>
+          <w:ilvl w:val="0"/>
+          <w:numId w:val="133"/>
+        </w:numPr>
+      </w:pPr>
+      <w:r>
+        <w:t>Discussion of Potential Risks: Initial brainstorming of technical, human, and schedule risks.</w:t>
+      </w:r>
+    </w:p>
+    <w:p>
+      <w:pPr>
+        <w:numPr>
+          <w:ilvl w:val="0"/>
+          <w:numId w:val="133"/>
+        </w:numPr>
+      </w:pPr>
+      <w:r>
+        <w:t>Action Items Registration:</w:t>
+      </w:r>
+    </w:p>
+    <w:tbl>
+      <w:tblPr>
+        <w:tblStyle w:val="TableGrid"/>
+        <w:tblW w:w="0" w:type="auto"/>
+        <w:tblLook w:val="04A0" w:firstRow="1" w:lastRow="0" w:firstColumn="1" w:lastColumn="0" w:noHBand="0" w:noVBand="1"/>
+      </w:tblPr>
+      <w:tblGrid>
+        <w:gridCol w:w="4158"/>
+        <w:gridCol w:w="2001"/>
+        <w:gridCol w:w="1290"/>
+      </w:tblGrid>
+      <w:tr>
+        <w:tc>
+          <w:tcPr>
+            <w:tcW w:w="0" w:type="auto"/>
+            <w:hideMark/>
+          </w:tcPr>
+          <w:p>
+            <w:r>
+              <w:t>Action Item</w:t>
+            </w:r>
+          </w:p>
+        </w:tc>
+        <w:tc>
+          <w:tcPr>
+            <w:tcW w:w="0" w:type="auto"/>
+            <w:hideMark/>
+          </w:tcPr>
+          <w:p>
+            <w:r>
+              <w:t>Assigned To</w:t>
+            </w:r>
+          </w:p>
+        </w:tc>
+        <w:tc>
+          <w:tcPr>
+            <w:tcW w:w="0" w:type="auto"/>
+            <w:hideMark/>
+          </w:tcPr>
+          <w:p>
+            <w:r>
+              <w:t>Due Date</w:t>
+            </w:r>
+          </w:p>
+        </w:tc>
+      </w:tr>
+      <w:tr>
+        <w:tc>
+          <w:tcPr>
+            <w:tcW w:w="0" w:type="auto"/>
+            <w:hideMark/>
+          </w:tcPr>
+          <w:p>
+            <w:r>
+              <w:t>Draft initial WBS Structure</w:t>
+            </w:r>
+          </w:p>
+        </w:tc>
+        <w:tc>
+          <w:tcPr>
+            <w:tcW w:w="0" w:type="auto"/>
+            <w:hideMark/>
+          </w:tcPr>
+          <w:p>
+            <w:r>
+              <w:t>Võ Duy Bình</w:t>
+            </w:r>
+          </w:p>
+        </w:tc>
+        <w:tc>
+          <w:tcPr>
+            <w:tcW w:w="0" w:type="auto"/>
+            <w:hideMark/>
+          </w:tcPr>
+          <w:p>
+            <w:r>
+              <w:t>July 15, 2026</w:t>
+            </w:r>
+          </w:p>
+        </w:tc>
+      </w:tr>
+      <w:tr>
+        <w:tc>
+          <w:tcPr>
+            <w:tcW w:w="0" w:type="auto"/>
+            <w:hideMark/>
+          </w:tcPr>
+          <w:p>
+            <w:r>
+              <w:t>Conduct student registration requirements survey</w:t>
+            </w:r>
+          </w:p>
+        </w:tc>
+        <w:tc>
+          <w:tcPr>
+            <w:tcW w:w="0" w:type="auto"/>
+            <w:hideMark/>
+          </w:tcPr>
+          <w:p>
+            <w:r>
+              <w:t>Nguy</w:t>
+            </w:r>
+            <w:r>
+              <w:rPr>
+                <w:rFonts w:ascii="Calibri" w:hAnsi="Calibri" w:cs="Calibri"/>
+              </w:rPr>
+              <w:t>ễ</w:t>
+            </w:r>
+            <w:r>
+              <w:t>n Thanh Quang</w:t>
+            </w:r>
+          </w:p>
+        </w:tc>
+        <w:tc>
+          <w:tcPr>
+            <w:tcW w:w="0" w:type="auto"/>
+            <w:hideMark/>
+          </w:tcPr>
+          <w:p>
+            <w:r>
+              <w:t>July 18, 2026</w:t>
+            </w:r>
+          </w:p>
+        </w:tc>
+      </w:tr>
+      <w:tr>
+        <w:tc>
+          <w:tcPr>
+            <w:tcW w:w="0" w:type="auto"/>
+            <w:hideMark/>
+          </w:tcPr>
+          <w:p>
+            <w:r>
+              <w:t>Prepare database schema ERD</w:t>
+            </w:r>
+          </w:p>
+        </w:tc>
+        <w:tc>
+          <w:tcPr>
+            <w:tcW w:w="0" w:type="auto"/>
+            <w:hideMark/>
+          </w:tcPr>
+          <w:p>
+            <w:r>
+              <w:t>H</w:t>
+            </w:r>
+            <w:r>
+              <w:rPr>
+                <w:rFonts w:ascii="Calibri" w:hAnsi="Calibri" w:cs="Calibri"/>
+              </w:rPr>
+              <w:t>ồ</w:t>
+            </w:r>
+            <w:r>
+              <w:t>ng B</w:t>
+            </w:r>
+            <w:r>
+              <w:rPr>
+                <w:rFonts w:ascii="Calibri" w:hAnsi="Calibri" w:cs="Calibri"/>
+              </w:rPr>
+              <w:t>ả</w:t>
+            </w:r>
+            <w:r>
+              <w:t>o Khang</w:t>
+            </w:r>
+          </w:p>
+        </w:tc>
+        <w:tc>
+          <w:tcPr>
+            <w:tcW w:w="0" w:type="auto"/>
+            <w:hideMark/>
+          </w:tcPr>
+          <w:p>
+            <w:r>
+              <w:t>July 20, 2026</w:t>
+            </w:r>
+          </w:p>
+        </w:tc>
+      </w:tr>
+      <w:tr>
+        <w:tc>
+          <w:tcPr>
+            <w:tcW w:w="0" w:type="auto"/>
+            <w:hideMark/>
+          </w:tcPr>
+          <w:p>
+            <w:r>
+              <w:t>Finalize Project Team Contract</w:t>
+            </w:r>
+          </w:p>
+        </w:tc>
+        <w:tc>
+          <w:tcPr>
+            <w:tcW w:w="0" w:type="auto"/>
+            <w:hideMark/>
+          </w:tcPr>
+          <w:p>
+            <w:r>
+              <w:t>Tr</w:t>
+            </w:r>
+            <w:r>
+              <w:rPr>
+                <w:rFonts w:ascii="Calibri" w:hAnsi="Calibri" w:cs="Calibri"/>
+              </w:rPr>
+              <w:t>ầ</w:t>
+            </w:r>
+            <w:r>
+              <w:t>n B</w:t>
+            </w:r>
+            <w:r>
+              <w:rPr>
+                <w:rFonts w:cs="Arial Narrow"/>
+              </w:rPr>
+              <w:t>á</w:t>
+            </w:r>
+            <w:r>
+              <w:t xml:space="preserve"> L</w:t>
+            </w:r>
+            <w:r>
+              <w:rPr>
+                <w:rFonts w:ascii="Calibri" w:hAnsi="Calibri" w:cs="Calibri"/>
+              </w:rPr>
+              <w:t>ợ</w:t>
+            </w:r>
+            <w:r>
+              <w:t>i</w:t>
+            </w:r>
+          </w:p>
+        </w:tc>
+        <w:tc>
+          <w:tcPr>
+            <w:tcW w:w="0" w:type="auto"/>
+            <w:hideMark/>
+          </w:tcPr>
+          <w:p>
+            <w:r>
+              <w:t>July 14, 2026</w:t>
+            </w:r>
+          </w:p>
+        </w:tc>
+      </w:tr>
+    </w:tbl>
+    <w:p>
+      <w:r>
+        <w:t>Date and Time of Next Meeting: July 20, 2026, at 20:00 (via Google Meet).</w:t>
+      </w:r>
+    </w:p>
+    <w:p>
+      <w:r>
+        <w:pict w14:anchorId="75BD2325">
+          <v:rect id="_x0000_i1031" style="width:0;height:3pt" o:hralign="center" o:hrstd="t" o:hr="t" fillcolor="#a0a0a0" stroked="f"/>
+        </w:pict>
+      </w:r>
+    </w:p>
+    <w:p>
+      <w:pPr>
+        <w:numPr>
+          <w:ilvl w:val="0"/>
+          <w:numId w:val="45"/>
+        </w:numPr>
+        <w:tabs>
+          <w:tab w:val="clear" w:pos="432"/>
+          <w:tab w:val="num" w:pos="360"/>
+        </w:tabs>
+      </w:pPr>
+      <w:r>
+        <w:t>Summary of 12 PMBOK Deliverables applied at JWD Consulting:</w:t>
+      </w:r>
+    </w:p>
+    <w:tbl>
+      <w:tblPr>
+        <w:tblStyle w:val="TableGrid"/>
+        <w:tblW w:w="0" w:type="auto"/>
+        <w:tblLook w:val="04A0" w:firstRow="1" w:lastRow="0" w:firstColumn="1" w:lastColumn="0" w:noHBand="0" w:noVBand="1"/>
+      </w:tblPr>
+      <w:tblGrid>
+        <w:gridCol w:w="2346"/>
+        <w:gridCol w:w="7004"/>
+      </w:tblGrid>
+      <w:tr>
+        <w:tc>
+          <w:tcPr>
+            <w:tcW w:w="0" w:type="auto"/>
+            <w:hideMark/>
+          </w:tcPr>
+          <w:p>
+            <w:r>
+              <w:t>Process Group</w:t>
+            </w:r>
+          </w:p>
+        </w:tc>
+        <w:tc>
+          <w:tcPr>
+            <w:tcW w:w="0" w:type="auto"/>
+            <w:hideMark/>
+          </w:tcPr>
+          <w:p>
+            <w:r>
+              <w:t>PMBOK Deliverable</w:t>
+            </w:r>
+          </w:p>
+        </w:tc>
+      </w:tr>
+      <w:tr>
+        <w:tc>
+          <w:tcPr>
+            <w:tcW w:w="0" w:type="auto"/>
+            <w:hideMark/>
+          </w:tcPr>
+          <w:p>
+            <w:r>
+              <w:t>1. Initiating (Seminar Focus)</w:t>
+            </w:r>
+          </w:p>
+        </w:tc>
+        <w:tc>
+          <w:tcPr>
+            <w:tcW w:w="0" w:type="auto"/>
+            <w:hideMark/>
+          </w:tcPr>
+          <w:p>
+            <w:r>
+              <w:t>• Business Case • Stakeholder Register &amp; Strategy • Project Charter • Kick-off Agenda &amp; Minutes</w:t>
+            </w:r>
+          </w:p>
+        </w:tc>
+      </w:tr>
+      <w:tr>
+        <w:tc>
+          <w:tcPr>
+            <w:tcW w:w="0" w:type="auto"/>
+            <w:hideMark/>
+          </w:tcPr>
+          <w:p>
+            <w:r>
+              <w:lastRenderedPageBreak/>
+              <w:t>2. Planning (Project Focus)</w:t>
+            </w:r>
+          </w:p>
+        </w:tc>
+        <w:tc>
+          <w:tcPr>
+            <w:tcW w:w="0" w:type="auto"/>
+            <w:hideMark/>
+          </w:tcPr>
+          <w:p>
+            <w:r>
+              <w:t>• Team Contract • Project Scope Statement • WBS • Baseline Gantt Chart • Prioritized Risk List</w:t>
+            </w:r>
+          </w:p>
+        </w:tc>
+      </w:tr>
+      <w:tr>
+        <w:tc>
+          <w:tcPr>
+            <w:tcW w:w="0" w:type="auto"/>
+            <w:hideMark/>
+          </w:tcPr>
+          <w:p>
+            <w:r>
+              <w:t>3. Executing (Project Focus)</w:t>
+            </w:r>
+          </w:p>
+        </w:tc>
+        <w:tc>
+          <w:tcPr>
+            <w:tcW w:w="0" w:type="auto"/>
+            <w:hideMark/>
+          </w:tcPr>
+          <w:p>
+            <w:r>
+              <w:t>• Milestone Reports • Survey &amp; User Inputs</w:t>
+            </w:r>
+          </w:p>
+        </w:tc>
+      </w:tr>
+      <w:tr>
+        <w:tc>
+          <w:tcPr>
+            <w:tcW w:w="0" w:type="auto"/>
+            <w:hideMark/>
+          </w:tcPr>
+          <w:p>
+            <w:r>
+              <w:t>4. Controlling (Project Focus)</w:t>
+            </w:r>
+          </w:p>
+        </w:tc>
+        <w:tc>
+          <w:tcPr>
+            <w:tcW w:w="0" w:type="auto"/>
+            <w:hideMark/>
+          </w:tcPr>
+          <w:p>
+            <w:r>
+              <w:t>• Weekly Progress Reports • Earned Value Management (EVM)</w:t>
+            </w:r>
+          </w:p>
+        </w:tc>
+      </w:tr>
+      <w:tr>
+        <w:tc>
+          <w:tcPr>
+            <w:tcW w:w="0" w:type="auto"/>
+            <w:hideMark/>
+          </w:tcPr>
+          <w:p>
+            <w:r>
+              <w:t>5. Closing (Project Focus)</w:t>
+            </w:r>
+          </w:p>
+        </w:tc>
+        <w:tc>
+          <w:tcPr>
+            <w:tcW w:w="0" w:type="auto"/>
+            <w:hideMark/>
+          </w:tcPr>
+          <w:p>
+            <w:r>
+              <w:t>• Final Project Report &amp; Presentation • Lessons-Learned Report • Client Acceptance Form</w:t>
+            </w:r>
+          </w:p>
+        </w:tc>
+      </w:tr>
+    </w:tbl>
+    <w:p>
+      <w:pPr>
         <w:rPr>
           <w:b/>
           <w:bCs/>
         </w:rPr>
       </w:pPr>
       <w:r>
-        <w:rPr>
-          <w:b/>
-          <w:bCs/>
-        </w:rPr>
         <w:br w:type="page"/>
       </w:r>
     </w:p>
@@ -19709,6 +20434,119 @@
     </w:lvl>
   </w:abstractNum>
   <w:abstractNum w:abstractNumId="50" w15:restartNumberingAfterBreak="0">
+    <w:nsid w:val="2E4414A6"/>
+    <w:multiLevelType w:val="multilevel"/>
+    <w:tmpl w:val="BB5A0A14"/>
+    <w:lvl w:ilvl="0">
+      <w:start w:val="1"/>
+      <w:numFmt w:val="decimal"/>
+      <w:lvlText w:val="%1."/>
+      <w:lvlJc w:val="left"/>
+      <w:pPr>
+        <w:tabs>
+          <w:tab w:val="num" w:pos="720"/>
+        </w:tabs>
+        <w:ind w:left="720" w:hanging="360"/>
+      </w:pPr>
+    </w:lvl>
+    <w:lvl w:ilvl="1" w:tentative="1">
+      <w:start w:val="1"/>
+      <w:numFmt w:val="decimal"/>
+      <w:lvlText w:val="%2."/>
+      <w:lvlJc w:val="left"/>
+      <w:pPr>
+        <w:tabs>
+          <w:tab w:val="num" w:pos="1440"/>
+        </w:tabs>
+        <w:ind w:left="1440" w:hanging="360"/>
+      </w:pPr>
+    </w:lvl>
+    <w:lvl w:ilvl="2" w:tentative="1">
+      <w:start w:val="1"/>
+      <w:numFmt w:val="decimal"/>
+      <w:lvlText w:val="%3."/>
+      <w:lvlJc w:val="left"/>
+      <w:pPr>
+        <w:tabs>
+          <w:tab w:val="num" w:pos="2160"/>
+        </w:tabs>
+        <w:ind w:left="2160" w:hanging="360"/>
+      </w:pPr>
+    </w:lvl>
+    <w:lvl w:ilvl="3" w:tentative="1">
+      <w:start w:val="1"/>
+      <w:numFmt w:val="decimal"/>
+      <w:lvlText w:val="%4."/>
+      <w:lvlJc w:val="left"/>
+      <w:pPr>
+        <w:tabs>
+          <w:tab w:val="num" w:pos="2880"/>
+        </w:tabs>
+        <w:ind w:left="2880" w:hanging="360"/>
+      </w:pPr>
+    </w:lvl>
+    <w:lvl w:ilvl="4" w:tentative="1">
+      <w:start w:val="1"/>
+      <w:numFmt w:val="decimal"/>
+      <w:lvlText w:val="%5."/>
+      <w:lvlJc w:val="left"/>
+      <w:pPr>
+        <w:tabs>
+          <w:tab w:val="num" w:pos="3600"/>
+        </w:tabs>
+        <w:ind w:left="3600" w:hanging="360"/>
+      </w:pPr>
+    </w:lvl>
+    <w:lvl w:ilvl="5" w:tentative="1">
+      <w:start w:val="1"/>
+      <w:numFmt w:val="decimal"/>
+      <w:lvlText w:val="%6."/>
+      <w:lvlJc w:val="left"/>
+      <w:pPr>
+        <w:tabs>
+          <w:tab w:val="num" w:pos="4320"/>
+        </w:tabs>
+        <w:ind w:left="4320" w:hanging="360"/>
+      </w:pPr>
+    </w:lvl>
+    <w:lvl w:ilvl="6" w:tentative="1">
+      <w:start w:val="1"/>
+      <w:numFmt w:val="decimal"/>
+      <w:lvlText w:val="%7."/>
+      <w:lvlJc w:val="left"/>
+      <w:pPr>
+        <w:tabs>
+          <w:tab w:val="num" w:pos="5040"/>
+        </w:tabs>
+        <w:ind w:left="5040" w:hanging="360"/>
+      </w:pPr>
+    </w:lvl>
+    <w:lvl w:ilvl="7" w:tentative="1">
+      <w:start w:val="1"/>
+      <w:numFmt w:val="decimal"/>
+      <w:lvlText w:val="%8."/>
+      <w:lvlJc w:val="left"/>
+      <w:pPr>
+        <w:tabs>
+          <w:tab w:val="num" w:pos="5760"/>
+        </w:tabs>
+        <w:ind w:left="5760" w:hanging="360"/>
+      </w:pPr>
+    </w:lvl>
+    <w:lvl w:ilvl="8" w:tentative="1">
+      <w:start w:val="1"/>
+      <w:numFmt w:val="decimal"/>
+      <w:lvlText w:val="%9."/>
+      <w:lvlJc w:val="left"/>
+      <w:pPr>
+        <w:tabs>
+          <w:tab w:val="num" w:pos="6480"/>
+        </w:tabs>
+        <w:ind w:left="6480" w:hanging="360"/>
+      </w:pPr>
+    </w:lvl>
+  </w:abstractNum>
+  <w:abstractNum w:abstractNumId="51" w15:restartNumberingAfterBreak="0">
     <w:nsid w:val="2E595A87"/>
     <w:multiLevelType w:val="multilevel"/>
     <w:tmpl w:val="5D8E702A"/>
@@ -19857,7 +20695,7 @@
       </w:rPr>
     </w:lvl>
   </w:abstractNum>
-  <w:abstractNum w:abstractNumId="51" w15:restartNumberingAfterBreak="0">
+  <w:abstractNum w:abstractNumId="52" w15:restartNumberingAfterBreak="0">
     <w:nsid w:val="302D76A9"/>
     <w:multiLevelType w:val="multilevel"/>
     <w:tmpl w:val="B210BA34"/>
@@ -20006,7 +20844,7 @@
       </w:rPr>
     </w:lvl>
   </w:abstractNum>
-  <w:abstractNum w:abstractNumId="52" w15:restartNumberingAfterBreak="0">
+  <w:abstractNum w:abstractNumId="53" w15:restartNumberingAfterBreak="0">
     <w:nsid w:val="31426F79"/>
     <w:multiLevelType w:val="multilevel"/>
     <w:tmpl w:val="8604BA82"/>
@@ -20155,7 +20993,7 @@
       </w:rPr>
     </w:lvl>
   </w:abstractNum>
-  <w:abstractNum w:abstractNumId="53" w15:restartNumberingAfterBreak="0">
+  <w:abstractNum w:abstractNumId="54" w15:restartNumberingAfterBreak="0">
     <w:nsid w:val="31C45FC9"/>
     <w:multiLevelType w:val="multilevel"/>
     <w:tmpl w:val="F82C34E2"/>
@@ -20304,7 +21142,7 @@
       </w:rPr>
     </w:lvl>
   </w:abstractNum>
-  <w:abstractNum w:abstractNumId="54" w15:restartNumberingAfterBreak="0">
+  <w:abstractNum w:abstractNumId="55" w15:restartNumberingAfterBreak="0">
     <w:nsid w:val="322B504E"/>
     <w:multiLevelType w:val="multilevel"/>
     <w:tmpl w:val="2B104F42"/>
@@ -20453,7 +21291,7 @@
       </w:rPr>
     </w:lvl>
   </w:abstractNum>
-  <w:abstractNum w:abstractNumId="55" w15:restartNumberingAfterBreak="0">
+  <w:abstractNum w:abstractNumId="56" w15:restartNumberingAfterBreak="0">
     <w:nsid w:val="325F317B"/>
     <w:multiLevelType w:val="multilevel"/>
     <w:tmpl w:val="DA661FD2"/>
@@ -20602,7 +21440,7 @@
       </w:rPr>
     </w:lvl>
   </w:abstractNum>
-  <w:abstractNum w:abstractNumId="56" w15:restartNumberingAfterBreak="0">
+  <w:abstractNum w:abstractNumId="57" w15:restartNumberingAfterBreak="0">
     <w:nsid w:val="33A754A3"/>
     <w:multiLevelType w:val="singleLevel"/>
     <w:tmpl w:val="0409001F"/>
@@ -20617,7 +21455,7 @@
       </w:pPr>
     </w:lvl>
   </w:abstractNum>
-  <w:abstractNum w:abstractNumId="57" w15:restartNumberingAfterBreak="0">
+  <w:abstractNum w:abstractNumId="58" w15:restartNumberingAfterBreak="0">
     <w:nsid w:val="36CC7E95"/>
     <w:multiLevelType w:val="multilevel"/>
     <w:tmpl w:val="E40EB2DC"/>
@@ -20766,7 +21604,7 @@
       </w:rPr>
     </w:lvl>
   </w:abstractNum>
-  <w:abstractNum w:abstractNumId="58" w15:restartNumberingAfterBreak="0">
+  <w:abstractNum w:abstractNumId="59" w15:restartNumberingAfterBreak="0">
     <w:nsid w:val="36F22BDF"/>
     <w:multiLevelType w:val="multilevel"/>
     <w:tmpl w:val="6504BA8E"/>
@@ -20915,7 +21753,7 @@
       </w:rPr>
     </w:lvl>
   </w:abstractNum>
-  <w:abstractNum w:abstractNumId="59" w15:restartNumberingAfterBreak="0">
+  <w:abstractNum w:abstractNumId="60" w15:restartNumberingAfterBreak="0">
     <w:nsid w:val="390546AE"/>
     <w:multiLevelType w:val="multilevel"/>
     <w:tmpl w:val="CE260090"/>
@@ -21060,7 +21898,7 @@
       </w:rPr>
     </w:lvl>
   </w:abstractNum>
-  <w:abstractNum w:abstractNumId="60" w15:restartNumberingAfterBreak="0">
+  <w:abstractNum w:abstractNumId="61" w15:restartNumberingAfterBreak="0">
     <w:nsid w:val="399E14CA"/>
     <w:multiLevelType w:val="multilevel"/>
     <w:tmpl w:val="9C30636E"/>
@@ -21209,7 +22047,7 @@
       </w:rPr>
     </w:lvl>
   </w:abstractNum>
-  <w:abstractNum w:abstractNumId="61" w15:restartNumberingAfterBreak="0">
+  <w:abstractNum w:abstractNumId="62" w15:restartNumberingAfterBreak="0">
     <w:nsid w:val="3B5A1FFF"/>
     <w:multiLevelType w:val="hybridMultilevel"/>
     <w:tmpl w:val="7654F16C"/>
@@ -21350,7 +22188,7 @@
       </w:rPr>
     </w:lvl>
   </w:abstractNum>
-  <w:abstractNum w:abstractNumId="62" w15:restartNumberingAfterBreak="0">
+  <w:abstractNum w:abstractNumId="63" w15:restartNumberingAfterBreak="0">
     <w:nsid w:val="3CA66329"/>
     <w:multiLevelType w:val="hybridMultilevel"/>
     <w:tmpl w:val="BC6631BA"/>
@@ -21490,7 +22328,7 @@
       </w:rPr>
     </w:lvl>
   </w:abstractNum>
-  <w:abstractNum w:abstractNumId="63" w15:restartNumberingAfterBreak="0">
+  <w:abstractNum w:abstractNumId="64" w15:restartNumberingAfterBreak="0">
     <w:nsid w:val="3DAB080B"/>
     <w:multiLevelType w:val="multilevel"/>
     <w:tmpl w:val="49F83962"/>
@@ -21639,7 +22477,7 @@
       </w:rPr>
     </w:lvl>
   </w:abstractNum>
-  <w:abstractNum w:abstractNumId="64" w15:restartNumberingAfterBreak="0">
+  <w:abstractNum w:abstractNumId="65" w15:restartNumberingAfterBreak="0">
     <w:nsid w:val="41ED5CD5"/>
     <w:multiLevelType w:val="multilevel"/>
     <w:tmpl w:val="5A0030F8"/>
@@ -21788,7 +22626,7 @@
       </w:rPr>
     </w:lvl>
   </w:abstractNum>
-  <w:abstractNum w:abstractNumId="65" w15:restartNumberingAfterBreak="0">
+  <w:abstractNum w:abstractNumId="66" w15:restartNumberingAfterBreak="0">
     <w:nsid w:val="427C506C"/>
     <w:multiLevelType w:val="multilevel"/>
     <w:tmpl w:val="3CF6026A"/>
@@ -21937,7 +22775,7 @@
       </w:rPr>
     </w:lvl>
   </w:abstractNum>
-  <w:abstractNum w:abstractNumId="66" w15:restartNumberingAfterBreak="0">
+  <w:abstractNum w:abstractNumId="67" w15:restartNumberingAfterBreak="0">
     <w:nsid w:val="44930A7A"/>
     <w:multiLevelType w:val="multilevel"/>
     <w:tmpl w:val="15BC3CBA"/>
@@ -22086,7 +22924,7 @@
       </w:rPr>
     </w:lvl>
   </w:abstractNum>
-  <w:abstractNum w:abstractNumId="67" w15:restartNumberingAfterBreak="0">
+  <w:abstractNum w:abstractNumId="68" w15:restartNumberingAfterBreak="0">
     <w:nsid w:val="4590703D"/>
     <w:multiLevelType w:val="multilevel"/>
     <w:tmpl w:val="CEAAD9F6"/>
@@ -22235,7 +23073,7 @@
       </w:rPr>
     </w:lvl>
   </w:abstractNum>
-  <w:abstractNum w:abstractNumId="68" w15:restartNumberingAfterBreak="0">
+  <w:abstractNum w:abstractNumId="69" w15:restartNumberingAfterBreak="0">
     <w:nsid w:val="471B0F66"/>
     <w:multiLevelType w:val="multilevel"/>
     <w:tmpl w:val="E536FD02"/>
@@ -22384,7 +23222,7 @@
       </w:rPr>
     </w:lvl>
   </w:abstractNum>
-  <w:abstractNum w:abstractNumId="69" w15:restartNumberingAfterBreak="0">
+  <w:abstractNum w:abstractNumId="70" w15:restartNumberingAfterBreak="0">
     <w:nsid w:val="480C280F"/>
     <w:multiLevelType w:val="multilevel"/>
     <w:tmpl w:val="2B2472B2"/>
@@ -22533,7 +23371,7 @@
       </w:rPr>
     </w:lvl>
   </w:abstractNum>
-  <w:abstractNum w:abstractNumId="70" w15:restartNumberingAfterBreak="0">
+  <w:abstractNum w:abstractNumId="71" w15:restartNumberingAfterBreak="0">
     <w:nsid w:val="482D3BE5"/>
     <w:multiLevelType w:val="multilevel"/>
     <w:tmpl w:val="A7CCACE4"/>
@@ -22682,7 +23520,7 @@
       </w:rPr>
     </w:lvl>
   </w:abstractNum>
-  <w:abstractNum w:abstractNumId="71" w15:restartNumberingAfterBreak="0">
+  <w:abstractNum w:abstractNumId="72" w15:restartNumberingAfterBreak="0">
     <w:nsid w:val="48720A7E"/>
     <w:multiLevelType w:val="multilevel"/>
     <w:tmpl w:val="9082486E"/>
@@ -22795,7 +23633,7 @@
       </w:pPr>
     </w:lvl>
   </w:abstractNum>
-  <w:abstractNum w:abstractNumId="72" w15:restartNumberingAfterBreak="0">
+  <w:abstractNum w:abstractNumId="73" w15:restartNumberingAfterBreak="0">
     <w:nsid w:val="4C354F42"/>
     <w:multiLevelType w:val="multilevel"/>
     <w:tmpl w:val="9534826A"/>
@@ -22944,7 +23782,7 @@
       </w:rPr>
     </w:lvl>
   </w:abstractNum>
-  <w:abstractNum w:abstractNumId="73" w15:restartNumberingAfterBreak="0">
+  <w:abstractNum w:abstractNumId="74" w15:restartNumberingAfterBreak="0">
     <w:nsid w:val="4C440916"/>
     <w:multiLevelType w:val="multilevel"/>
     <w:tmpl w:val="D2B2AA2A"/>
@@ -23089,7 +23927,7 @@
       </w:rPr>
     </w:lvl>
   </w:abstractNum>
-  <w:abstractNum w:abstractNumId="74" w15:restartNumberingAfterBreak="0">
+  <w:abstractNum w:abstractNumId="75" w15:restartNumberingAfterBreak="0">
     <w:nsid w:val="4D96280D"/>
     <w:multiLevelType w:val="multilevel"/>
     <w:tmpl w:val="4F306264"/>
@@ -23238,7 +24076,7 @@
       </w:rPr>
     </w:lvl>
   </w:abstractNum>
-  <w:abstractNum w:abstractNumId="75" w15:restartNumberingAfterBreak="0">
+  <w:abstractNum w:abstractNumId="76" w15:restartNumberingAfterBreak="0">
     <w:nsid w:val="4D9D3D22"/>
     <w:multiLevelType w:val="multilevel"/>
     <w:tmpl w:val="013A5DC0"/>
@@ -23387,7 +24225,7 @@
       </w:rPr>
     </w:lvl>
   </w:abstractNum>
-  <w:abstractNum w:abstractNumId="76" w15:restartNumberingAfterBreak="0">
+  <w:abstractNum w:abstractNumId="77" w15:restartNumberingAfterBreak="0">
     <w:nsid w:val="4DB25ED4"/>
     <w:multiLevelType w:val="multilevel"/>
     <w:tmpl w:val="46303434"/>
@@ -23536,7 +24374,7 @@
       </w:rPr>
     </w:lvl>
   </w:abstractNum>
-  <w:abstractNum w:abstractNumId="77" w15:restartNumberingAfterBreak="0">
+  <w:abstractNum w:abstractNumId="78" w15:restartNumberingAfterBreak="0">
     <w:nsid w:val="4E722213"/>
     <w:multiLevelType w:val="multilevel"/>
     <w:tmpl w:val="BC7EB1E6"/>
@@ -23676,7 +24514,7 @@
       </w:rPr>
     </w:lvl>
   </w:abstractNum>
-  <w:abstractNum w:abstractNumId="78" w15:restartNumberingAfterBreak="0">
+  <w:abstractNum w:abstractNumId="79" w15:restartNumberingAfterBreak="0">
     <w:nsid w:val="4F1F20D4"/>
     <w:multiLevelType w:val="multilevel"/>
     <w:tmpl w:val="453C8B14"/>
@@ -23825,7 +24663,7 @@
       </w:rPr>
     </w:lvl>
   </w:abstractNum>
-  <w:abstractNum w:abstractNumId="79" w15:restartNumberingAfterBreak="0">
+  <w:abstractNum w:abstractNumId="80" w15:restartNumberingAfterBreak="0">
     <w:nsid w:val="51713393"/>
     <w:multiLevelType w:val="singleLevel"/>
     <w:tmpl w:val="0409001F"/>
@@ -23840,7 +24678,7 @@
       </w:pPr>
     </w:lvl>
   </w:abstractNum>
-  <w:abstractNum w:abstractNumId="80" w15:restartNumberingAfterBreak="0">
+  <w:abstractNum w:abstractNumId="81" w15:restartNumberingAfterBreak="0">
     <w:nsid w:val="53C275A7"/>
     <w:multiLevelType w:val="hybridMultilevel"/>
     <w:tmpl w:val="B1AA5BD4"/>
@@ -23990,7 +24828,7 @@
       </w:rPr>
     </w:lvl>
   </w:abstractNum>
-  <w:abstractNum w:abstractNumId="81" w15:restartNumberingAfterBreak="0">
+  <w:abstractNum w:abstractNumId="82" w15:restartNumberingAfterBreak="0">
     <w:nsid w:val="5434155C"/>
     <w:multiLevelType w:val="singleLevel"/>
     <w:tmpl w:val="0409001F"/>
@@ -24005,7 +24843,7 @@
       </w:pPr>
     </w:lvl>
   </w:abstractNum>
-  <w:abstractNum w:abstractNumId="82" w15:restartNumberingAfterBreak="0">
+  <w:abstractNum w:abstractNumId="83" w15:restartNumberingAfterBreak="0">
     <w:nsid w:val="54367603"/>
     <w:multiLevelType w:val="multilevel"/>
     <w:tmpl w:val="6950B704"/>
@@ -24154,7 +24992,7 @@
       </w:rPr>
     </w:lvl>
   </w:abstractNum>
-  <w:abstractNum w:abstractNumId="83" w15:restartNumberingAfterBreak="0">
+  <w:abstractNum w:abstractNumId="84" w15:restartNumberingAfterBreak="0">
     <w:nsid w:val="549362D7"/>
     <w:multiLevelType w:val="singleLevel"/>
     <w:tmpl w:val="AA9E1076"/>
@@ -24172,7 +25010,7 @@
       </w:pPr>
     </w:lvl>
   </w:abstractNum>
-  <w:abstractNum w:abstractNumId="84" w15:restartNumberingAfterBreak="0">
+  <w:abstractNum w:abstractNumId="85" w15:restartNumberingAfterBreak="0">
     <w:nsid w:val="57A6470A"/>
     <w:multiLevelType w:val="multilevel"/>
     <w:tmpl w:val="9F82CA08"/>
@@ -24317,7 +25155,7 @@
       </w:rPr>
     </w:lvl>
   </w:abstractNum>
-  <w:abstractNum w:abstractNumId="85" w15:restartNumberingAfterBreak="0">
+  <w:abstractNum w:abstractNumId="86" w15:restartNumberingAfterBreak="0">
     <w:nsid w:val="57D561B0"/>
     <w:multiLevelType w:val="multilevel"/>
     <w:tmpl w:val="29C0EED4"/>
@@ -24466,7 +25304,7 @@
       </w:rPr>
     </w:lvl>
   </w:abstractNum>
-  <w:abstractNum w:abstractNumId="86" w15:restartNumberingAfterBreak="0">
+  <w:abstractNum w:abstractNumId="87" w15:restartNumberingAfterBreak="0">
     <w:nsid w:val="584638B1"/>
     <w:multiLevelType w:val="multilevel"/>
     <w:tmpl w:val="41E0B7CE"/>
@@ -24615,7 +25453,7 @@
       </w:rPr>
     </w:lvl>
   </w:abstractNum>
-  <w:abstractNum w:abstractNumId="87" w15:restartNumberingAfterBreak="0">
+  <w:abstractNum w:abstractNumId="88" w15:restartNumberingAfterBreak="0">
     <w:nsid w:val="588F2F1C"/>
     <w:multiLevelType w:val="multilevel"/>
     <w:tmpl w:val="2FB0DCC0"/>
@@ -24764,7 +25602,7 @@
       </w:rPr>
     </w:lvl>
   </w:abstractNum>
-  <w:abstractNum w:abstractNumId="88" w15:restartNumberingAfterBreak="0">
+  <w:abstractNum w:abstractNumId="89" w15:restartNumberingAfterBreak="0">
     <w:nsid w:val="5B563288"/>
     <w:multiLevelType w:val="multilevel"/>
     <w:tmpl w:val="FD0C42B2"/>
@@ -24913,7 +25751,7 @@
       </w:rPr>
     </w:lvl>
   </w:abstractNum>
-  <w:abstractNum w:abstractNumId="89" w15:restartNumberingAfterBreak="0">
+  <w:abstractNum w:abstractNumId="90" w15:restartNumberingAfterBreak="0">
     <w:nsid w:val="5C7C3DE1"/>
     <w:multiLevelType w:val="multilevel"/>
     <w:tmpl w:val="5246B08C"/>
@@ -25062,7 +25900,7 @@
       </w:rPr>
     </w:lvl>
   </w:abstractNum>
-  <w:abstractNum w:abstractNumId="90" w15:restartNumberingAfterBreak="0">
+  <w:abstractNum w:abstractNumId="91" w15:restartNumberingAfterBreak="0">
     <w:nsid w:val="5E121A63"/>
     <w:multiLevelType w:val="multilevel"/>
     <w:tmpl w:val="12E6581E"/>
@@ -25179,7 +26017,7 @@
       </w:pPr>
     </w:lvl>
   </w:abstractNum>
-  <w:abstractNum w:abstractNumId="91" w15:restartNumberingAfterBreak="0">
+  <w:abstractNum w:abstractNumId="92" w15:restartNumberingAfterBreak="0">
     <w:nsid w:val="5E717151"/>
     <w:multiLevelType w:val="multilevel"/>
     <w:tmpl w:val="30DE13BC"/>
@@ -25328,7 +26166,7 @@
       </w:rPr>
     </w:lvl>
   </w:abstractNum>
-  <w:abstractNum w:abstractNumId="92" w15:restartNumberingAfterBreak="0">
+  <w:abstractNum w:abstractNumId="93" w15:restartNumberingAfterBreak="0">
     <w:nsid w:val="5F9A50CC"/>
     <w:multiLevelType w:val="multilevel"/>
     <w:tmpl w:val="3BA2FDE8"/>
@@ -25477,7 +26315,7 @@
       </w:rPr>
     </w:lvl>
   </w:abstractNum>
-  <w:abstractNum w:abstractNumId="93" w15:restartNumberingAfterBreak="0">
+  <w:abstractNum w:abstractNumId="94" w15:restartNumberingAfterBreak="0">
     <w:nsid w:val="61473079"/>
     <w:multiLevelType w:val="multilevel"/>
     <w:tmpl w:val="813EBF16"/>
@@ -25617,7 +26455,7 @@
       </w:rPr>
     </w:lvl>
   </w:abstractNum>
-  <w:abstractNum w:abstractNumId="94" w15:restartNumberingAfterBreak="0">
+  <w:abstractNum w:abstractNumId="95" w15:restartNumberingAfterBreak="0">
     <w:nsid w:val="61942C18"/>
     <w:multiLevelType w:val="singleLevel"/>
     <w:tmpl w:val="0409001F"/>
@@ -25632,7 +26470,7 @@
       </w:pPr>
     </w:lvl>
   </w:abstractNum>
-  <w:abstractNum w:abstractNumId="95" w15:restartNumberingAfterBreak="0">
+  <w:abstractNum w:abstractNumId="96" w15:restartNumberingAfterBreak="0">
     <w:nsid w:val="61D161F3"/>
     <w:multiLevelType w:val="multilevel"/>
     <w:tmpl w:val="5E789FA4"/>
@@ -25781,7 +26619,7 @@
       </w:rPr>
     </w:lvl>
   </w:abstractNum>
-  <w:abstractNum w:abstractNumId="96" w15:restartNumberingAfterBreak="0">
+  <w:abstractNum w:abstractNumId="97" w15:restartNumberingAfterBreak="0">
     <w:nsid w:val="6553741E"/>
     <w:multiLevelType w:val="multilevel"/>
     <w:tmpl w:val="CC78C2F0"/>
@@ -25930,10 +26768,10 @@
       </w:rPr>
     </w:lvl>
   </w:abstractNum>
-  <w:abstractNum w:abstractNumId="97" w15:restartNumberingAfterBreak="0">
+  <w:abstractNum w:abstractNumId="98" w15:restartNumberingAfterBreak="0">
     <w:nsid w:val="66F16761"/>
     <w:multiLevelType w:val="multilevel"/>
-    <w:tmpl w:val="502AF1C0"/>
+    <w:tmpl w:val="DECA730C"/>
     <w:lvl w:ilvl="0">
       <w:start w:val="1"/>
       <w:numFmt w:val="decimal"/>
@@ -25950,6 +26788,7 @@
     <w:lvl w:ilvl="1">
       <w:start w:val="1"/>
       <w:numFmt w:val="decimal"/>
+      <w:pStyle w:val="Heading2"/>
       <w:lvlText w:val="%1.%2"/>
       <w:lvlJc w:val="left"/>
       <w:pPr>
@@ -26051,7 +26890,7 @@
       </w:pPr>
     </w:lvl>
   </w:abstractNum>
-  <w:abstractNum w:abstractNumId="98" w15:restartNumberingAfterBreak="0">
+  <w:abstractNum w:abstractNumId="99" w15:restartNumberingAfterBreak="0">
     <w:nsid w:val="684B4A0C"/>
     <w:multiLevelType w:val="multilevel"/>
     <w:tmpl w:val="D35ADDFC"/>
@@ -26196,7 +27035,7 @@
       </w:rPr>
     </w:lvl>
   </w:abstractNum>
-  <w:abstractNum w:abstractNumId="99" w15:restartNumberingAfterBreak="0">
+  <w:abstractNum w:abstractNumId="100" w15:restartNumberingAfterBreak="0">
     <w:nsid w:val="685559BA"/>
     <w:multiLevelType w:val="singleLevel"/>
     <w:tmpl w:val="0409001F"/>
@@ -26211,7 +27050,7 @@
       </w:pPr>
     </w:lvl>
   </w:abstractNum>
-  <w:abstractNum w:abstractNumId="100" w15:restartNumberingAfterBreak="0">
+  <w:abstractNum w:abstractNumId="101" w15:restartNumberingAfterBreak="0">
     <w:nsid w:val="686F34BF"/>
     <w:multiLevelType w:val="singleLevel"/>
     <w:tmpl w:val="0409001F"/>
@@ -26226,7 +27065,7 @@
       </w:pPr>
     </w:lvl>
   </w:abstractNum>
-  <w:abstractNum w:abstractNumId="101" w15:restartNumberingAfterBreak="0">
+  <w:abstractNum w:abstractNumId="102" w15:restartNumberingAfterBreak="0">
     <w:nsid w:val="6967540A"/>
     <w:multiLevelType w:val="multilevel"/>
     <w:tmpl w:val="1918EBA0"/>
@@ -26375,7 +27214,7 @@
       </w:rPr>
     </w:lvl>
   </w:abstractNum>
-  <w:abstractNum w:abstractNumId="102" w15:restartNumberingAfterBreak="0">
+  <w:abstractNum w:abstractNumId="103" w15:restartNumberingAfterBreak="0">
     <w:nsid w:val="69CF0967"/>
     <w:multiLevelType w:val="multilevel"/>
     <w:tmpl w:val="B2306CD0"/>
@@ -26520,7 +27359,7 @@
       </w:rPr>
     </w:lvl>
   </w:abstractNum>
-  <w:abstractNum w:abstractNumId="103" w15:restartNumberingAfterBreak="0">
+  <w:abstractNum w:abstractNumId="104" w15:restartNumberingAfterBreak="0">
     <w:nsid w:val="6B422379"/>
     <w:multiLevelType w:val="multilevel"/>
     <w:tmpl w:val="F8A8E3B0"/>
@@ -26665,7 +27504,7 @@
       </w:rPr>
     </w:lvl>
   </w:abstractNum>
-  <w:abstractNum w:abstractNumId="104" w15:restartNumberingAfterBreak="0">
+  <w:abstractNum w:abstractNumId="105" w15:restartNumberingAfterBreak="0">
     <w:nsid w:val="6B7535DE"/>
     <w:multiLevelType w:val="multilevel"/>
     <w:tmpl w:val="74E85FE0"/>
@@ -26814,7 +27653,7 @@
       </w:rPr>
     </w:lvl>
   </w:abstractNum>
-  <w:abstractNum w:abstractNumId="105" w15:restartNumberingAfterBreak="0">
+  <w:abstractNum w:abstractNumId="106" w15:restartNumberingAfterBreak="0">
     <w:nsid w:val="6C861EBC"/>
     <w:multiLevelType w:val="multilevel"/>
     <w:tmpl w:val="A52C3182"/>
@@ -26963,7 +27802,7 @@
       </w:rPr>
     </w:lvl>
   </w:abstractNum>
-  <w:abstractNum w:abstractNumId="106" w15:restartNumberingAfterBreak="0">
+  <w:abstractNum w:abstractNumId="107" w15:restartNumberingAfterBreak="0">
     <w:nsid w:val="6EBE41F6"/>
     <w:multiLevelType w:val="singleLevel"/>
     <w:tmpl w:val="0409001F"/>
@@ -26978,7 +27817,7 @@
       </w:pPr>
     </w:lvl>
   </w:abstractNum>
-  <w:abstractNum w:abstractNumId="107" w15:restartNumberingAfterBreak="0">
+  <w:abstractNum w:abstractNumId="108" w15:restartNumberingAfterBreak="0">
     <w:nsid w:val="6EFE513C"/>
     <w:multiLevelType w:val="hybridMultilevel"/>
     <w:tmpl w:val="3C74A75C"/>
@@ -27119,7 +27958,7 @@
       </w:rPr>
     </w:lvl>
   </w:abstractNum>
-  <w:abstractNum w:abstractNumId="108" w15:restartNumberingAfterBreak="0">
+  <w:abstractNum w:abstractNumId="109" w15:restartNumberingAfterBreak="0">
     <w:nsid w:val="6F5607B8"/>
     <w:multiLevelType w:val="multilevel"/>
     <w:tmpl w:val="7CB81DC4"/>
@@ -27268,7 +28107,7 @@
       </w:rPr>
     </w:lvl>
   </w:abstractNum>
-  <w:abstractNum w:abstractNumId="109" w15:restartNumberingAfterBreak="0">
+  <w:abstractNum w:abstractNumId="110" w15:restartNumberingAfterBreak="0">
     <w:nsid w:val="710057A3"/>
     <w:multiLevelType w:val="multilevel"/>
     <w:tmpl w:val="4DE0EA9E"/>
@@ -27417,7 +28256,7 @@
       </w:rPr>
     </w:lvl>
   </w:abstractNum>
-  <w:abstractNum w:abstractNumId="110" w15:restartNumberingAfterBreak="0">
+  <w:abstractNum w:abstractNumId="111" w15:restartNumberingAfterBreak="0">
     <w:nsid w:val="7147134A"/>
     <w:multiLevelType w:val="multilevel"/>
     <w:tmpl w:val="0409001F"/>
@@ -27530,7 +28369,7 @@
       </w:pPr>
     </w:lvl>
   </w:abstractNum>
-  <w:abstractNum w:abstractNumId="111" w15:restartNumberingAfterBreak="0">
+  <w:abstractNum w:abstractNumId="112" w15:restartNumberingAfterBreak="0">
     <w:nsid w:val="716E49D7"/>
     <w:multiLevelType w:val="multilevel"/>
     <w:tmpl w:val="5A30617A"/>
@@ -27675,7 +28514,7 @@
       </w:rPr>
     </w:lvl>
   </w:abstractNum>
-  <w:abstractNum w:abstractNumId="112" w15:restartNumberingAfterBreak="0">
+  <w:abstractNum w:abstractNumId="113" w15:restartNumberingAfterBreak="0">
     <w:nsid w:val="717D15E5"/>
     <w:multiLevelType w:val="multilevel"/>
     <w:tmpl w:val="6CD21568"/>
@@ -27824,7 +28663,7 @@
       </w:rPr>
     </w:lvl>
   </w:abstractNum>
-  <w:abstractNum w:abstractNumId="113" w15:restartNumberingAfterBreak="0">
+  <w:abstractNum w:abstractNumId="114" w15:restartNumberingAfterBreak="0">
     <w:nsid w:val="722849D0"/>
     <w:multiLevelType w:val="multilevel"/>
     <w:tmpl w:val="FB2C6BF0"/>
@@ -27973,7 +28812,7 @@
       </w:rPr>
     </w:lvl>
   </w:abstractNum>
-  <w:abstractNum w:abstractNumId="114" w15:restartNumberingAfterBreak="0">
+  <w:abstractNum w:abstractNumId="115" w15:restartNumberingAfterBreak="0">
     <w:nsid w:val="72B30CA2"/>
     <w:multiLevelType w:val="multilevel"/>
     <w:tmpl w:val="5022B958"/>
@@ -28122,7 +28961,7 @@
       </w:rPr>
     </w:lvl>
   </w:abstractNum>
-  <w:abstractNum w:abstractNumId="115" w15:restartNumberingAfterBreak="0">
+  <w:abstractNum w:abstractNumId="116" w15:restartNumberingAfterBreak="0">
     <w:nsid w:val="72FA1F48"/>
     <w:multiLevelType w:val="multilevel"/>
     <w:tmpl w:val="4E20A5BC"/>
@@ -28267,7 +29106,7 @@
       </w:rPr>
     </w:lvl>
   </w:abstractNum>
-  <w:abstractNum w:abstractNumId="116" w15:restartNumberingAfterBreak="0">
+  <w:abstractNum w:abstractNumId="117" w15:restartNumberingAfterBreak="0">
     <w:nsid w:val="73460D01"/>
     <w:multiLevelType w:val="multilevel"/>
     <w:tmpl w:val="0D0A8736"/>
@@ -28416,7 +29255,7 @@
       </w:rPr>
     </w:lvl>
   </w:abstractNum>
-  <w:abstractNum w:abstractNumId="117" w15:restartNumberingAfterBreak="0">
+  <w:abstractNum w:abstractNumId="118" w15:restartNumberingAfterBreak="0">
     <w:nsid w:val="747D27ED"/>
     <w:multiLevelType w:val="multilevel"/>
     <w:tmpl w:val="B8507048"/>
@@ -28565,7 +29404,7 @@
       </w:rPr>
     </w:lvl>
   </w:abstractNum>
-  <w:abstractNum w:abstractNumId="118" w15:restartNumberingAfterBreak="0">
+  <w:abstractNum w:abstractNumId="119" w15:restartNumberingAfterBreak="0">
     <w:nsid w:val="77BE7E5B"/>
     <w:multiLevelType w:val="multilevel"/>
     <w:tmpl w:val="8A509B60"/>
@@ -28714,7 +29553,7 @@
       </w:rPr>
     </w:lvl>
   </w:abstractNum>
-  <w:abstractNum w:abstractNumId="119" w15:restartNumberingAfterBreak="0">
+  <w:abstractNum w:abstractNumId="120" w15:restartNumberingAfterBreak="0">
     <w:nsid w:val="77D20E3A"/>
     <w:multiLevelType w:val="multilevel"/>
     <w:tmpl w:val="B2444F36"/>
@@ -28863,7 +29702,7 @@
       </w:rPr>
     </w:lvl>
   </w:abstractNum>
-  <w:abstractNum w:abstractNumId="120" w15:restartNumberingAfterBreak="0">
+  <w:abstractNum w:abstractNumId="121" w15:restartNumberingAfterBreak="0">
     <w:nsid w:val="791A22C0"/>
     <w:multiLevelType w:val="multilevel"/>
     <w:tmpl w:val="0BC02BF4"/>
@@ -29012,7 +29851,7 @@
       </w:rPr>
     </w:lvl>
   </w:abstractNum>
-  <w:abstractNum w:abstractNumId="121" w15:restartNumberingAfterBreak="0">
+  <w:abstractNum w:abstractNumId="122" w15:restartNumberingAfterBreak="0">
     <w:nsid w:val="798F489C"/>
     <w:multiLevelType w:val="multilevel"/>
     <w:tmpl w:val="266A3446"/>
@@ -29161,7 +30000,7 @@
       </w:rPr>
     </w:lvl>
   </w:abstractNum>
-  <w:abstractNum w:abstractNumId="122" w15:restartNumberingAfterBreak="0">
+  <w:abstractNum w:abstractNumId="123" w15:restartNumberingAfterBreak="0">
     <w:nsid w:val="7AFB45D8"/>
     <w:multiLevelType w:val="multilevel"/>
     <w:tmpl w:val="677EC32C"/>
@@ -29310,7 +30149,7 @@
       </w:rPr>
     </w:lvl>
   </w:abstractNum>
-  <w:abstractNum w:abstractNumId="123" w15:restartNumberingAfterBreak="0">
+  <w:abstractNum w:abstractNumId="124" w15:restartNumberingAfterBreak="0">
     <w:nsid w:val="7B430FB1"/>
     <w:multiLevelType w:val="multilevel"/>
     <w:tmpl w:val="46DA9080"/>
@@ -29423,7 +30262,7 @@
       </w:pPr>
     </w:lvl>
   </w:abstractNum>
-  <w:abstractNum w:abstractNumId="124" w15:restartNumberingAfterBreak="0">
+  <w:abstractNum w:abstractNumId="125" w15:restartNumberingAfterBreak="0">
     <w:nsid w:val="7DB14662"/>
     <w:multiLevelType w:val="multilevel"/>
     <w:tmpl w:val="CBD43552"/>
@@ -29572,7 +30411,7 @@
       </w:rPr>
     </w:lvl>
   </w:abstractNum>
-  <w:abstractNum w:abstractNumId="125" w15:restartNumberingAfterBreak="0">
+  <w:abstractNum w:abstractNumId="126" w15:restartNumberingAfterBreak="0">
     <w:nsid w:val="7E8469A5"/>
     <w:multiLevelType w:val="hybridMultilevel"/>
     <w:tmpl w:val="62467E6A"/>
@@ -29712,7 +30551,7 @@
       </w:rPr>
     </w:lvl>
   </w:abstractNum>
-  <w:abstractNum w:abstractNumId="126" w15:restartNumberingAfterBreak="0">
+  <w:abstractNum w:abstractNumId="127" w15:restartNumberingAfterBreak="0">
     <w:nsid w:val="7F261EC3"/>
     <w:multiLevelType w:val="multilevel"/>
     <w:tmpl w:val="AEA46224"/>
@@ -29865,13 +30704,13 @@
     <w:abstractNumId w:val="19"/>
   </w:num>
   <w:num w:numId="2" w16cid:durableId="2136362245">
-    <w:abstractNumId w:val="90"/>
+    <w:abstractNumId w:val="91"/>
   </w:num>
   <w:num w:numId="3" w16cid:durableId="2090148486">
-    <w:abstractNumId w:val="124"/>
+    <w:abstractNumId w:val="125"/>
   </w:num>
   <w:num w:numId="4" w16cid:durableId="123811299">
-    <w:abstractNumId w:val="60"/>
+    <w:abstractNumId w:val="61"/>
   </w:num>
   <w:num w:numId="5" w16cid:durableId="1502114684">
     <w:abstractNumId w:val="8"/>
@@ -29883,58 +30722,58 @@
     <w:abstractNumId w:val="11"/>
   </w:num>
   <w:num w:numId="8" w16cid:durableId="1158231374">
-    <w:abstractNumId w:val="112"/>
+    <w:abstractNumId w:val="113"/>
   </w:num>
   <w:num w:numId="9" w16cid:durableId="1313826080">
-    <w:abstractNumId w:val="50"/>
+    <w:abstractNumId w:val="51"/>
   </w:num>
   <w:num w:numId="10" w16cid:durableId="178086858">
-    <w:abstractNumId w:val="64"/>
+    <w:abstractNumId w:val="65"/>
   </w:num>
   <w:num w:numId="11" w16cid:durableId="1036542994">
     <w:abstractNumId w:val="18"/>
   </w:num>
   <w:num w:numId="12" w16cid:durableId="2121874132">
-    <w:abstractNumId w:val="117"/>
+    <w:abstractNumId w:val="118"/>
   </w:num>
   <w:num w:numId="13" w16cid:durableId="895622801">
     <w:abstractNumId w:val="23"/>
   </w:num>
   <w:num w:numId="14" w16cid:durableId="214703417">
-    <w:abstractNumId w:val="74"/>
+    <w:abstractNumId w:val="75"/>
   </w:num>
   <w:num w:numId="15" w16cid:durableId="347409143">
-    <w:abstractNumId w:val="75"/>
+    <w:abstractNumId w:val="76"/>
   </w:num>
   <w:num w:numId="16" w16cid:durableId="49884395">
-    <w:abstractNumId w:val="66"/>
+    <w:abstractNumId w:val="67"/>
   </w:num>
   <w:num w:numId="17" w16cid:durableId="451944266">
-    <w:abstractNumId w:val="108"/>
+    <w:abstractNumId w:val="109"/>
   </w:num>
   <w:num w:numId="18" w16cid:durableId="1254584875">
     <w:abstractNumId w:val="16"/>
   </w:num>
   <w:num w:numId="19" w16cid:durableId="1133643845">
-    <w:abstractNumId w:val="58"/>
+    <w:abstractNumId w:val="59"/>
   </w:num>
   <w:num w:numId="20" w16cid:durableId="560679839">
-    <w:abstractNumId w:val="113"/>
+    <w:abstractNumId w:val="114"/>
   </w:num>
   <w:num w:numId="21" w16cid:durableId="1148091451">
-    <w:abstractNumId w:val="72"/>
+    <w:abstractNumId w:val="73"/>
   </w:num>
   <w:num w:numId="22" w16cid:durableId="69037044">
-    <w:abstractNumId w:val="53"/>
+    <w:abstractNumId w:val="54"/>
   </w:num>
   <w:num w:numId="23" w16cid:durableId="422342513">
-    <w:abstractNumId w:val="57"/>
+    <w:abstractNumId w:val="58"/>
   </w:num>
   <w:num w:numId="24" w16cid:durableId="1824469636">
     <w:abstractNumId w:val="27"/>
   </w:num>
   <w:num w:numId="25" w16cid:durableId="311377206">
-    <w:abstractNumId w:val="55"/>
+    <w:abstractNumId w:val="56"/>
   </w:num>
   <w:num w:numId="26" w16cid:durableId="92744350">
     <w:abstractNumId w:val="14"/>
@@ -29949,40 +30788,40 @@
     <w:abstractNumId w:val="28"/>
   </w:num>
   <w:num w:numId="30" w16cid:durableId="152842631">
-    <w:abstractNumId w:val="71"/>
+    <w:abstractNumId w:val="72"/>
   </w:num>
   <w:num w:numId="31" w16cid:durableId="191308114">
-    <w:abstractNumId w:val="123"/>
+    <w:abstractNumId w:val="124"/>
   </w:num>
   <w:num w:numId="32" w16cid:durableId="1783959145">
-    <w:abstractNumId w:val="105"/>
+    <w:abstractNumId w:val="106"/>
   </w:num>
   <w:num w:numId="33" w16cid:durableId="762803473">
     <w:abstractNumId w:val="20"/>
   </w:num>
   <w:num w:numId="34" w16cid:durableId="1248542647">
-    <w:abstractNumId w:val="89"/>
+    <w:abstractNumId w:val="90"/>
   </w:num>
   <w:num w:numId="35" w16cid:durableId="772940621">
     <w:abstractNumId w:val="12"/>
   </w:num>
   <w:num w:numId="36" w16cid:durableId="1196427462">
-    <w:abstractNumId w:val="116"/>
+    <w:abstractNumId w:val="117"/>
   </w:num>
   <w:num w:numId="37" w16cid:durableId="6488918">
-    <w:abstractNumId w:val="76"/>
+    <w:abstractNumId w:val="77"/>
   </w:num>
   <w:num w:numId="38" w16cid:durableId="1277323106">
     <w:abstractNumId w:val="49"/>
   </w:num>
   <w:num w:numId="39" w16cid:durableId="244337932">
-    <w:abstractNumId w:val="96"/>
+    <w:abstractNumId w:val="97"/>
   </w:num>
   <w:num w:numId="40" w16cid:durableId="1262647630">
     <w:abstractNumId w:val="5"/>
   </w:num>
   <w:num w:numId="41" w16cid:durableId="1551989985">
-    <w:abstractNumId w:val="98"/>
+    <w:abstractNumId w:val="99"/>
   </w:num>
   <w:num w:numId="42" w16cid:durableId="223491725">
     <w:abstractNumId w:val="30"/>
@@ -30007,25 +30846,25 @@
     </w:lvlOverride>
   </w:num>
   <w:num w:numId="44" w16cid:durableId="1187141041">
-    <w:abstractNumId w:val="80"/>
+    <w:abstractNumId w:val="81"/>
   </w:num>
   <w:num w:numId="45" w16cid:durableId="770466643">
-    <w:abstractNumId w:val="97"/>
+    <w:abstractNumId w:val="98"/>
   </w:num>
   <w:num w:numId="46" w16cid:durableId="726801792">
-    <w:abstractNumId w:val="83"/>
+    <w:abstractNumId w:val="84"/>
   </w:num>
   <w:num w:numId="47" w16cid:durableId="1630550541">
     <w:abstractNumId w:val="24"/>
   </w:num>
   <w:num w:numId="48" w16cid:durableId="934289338">
-    <w:abstractNumId w:val="107"/>
+    <w:abstractNumId w:val="108"/>
   </w:num>
   <w:num w:numId="49" w16cid:durableId="1318000441">
     <w:abstractNumId w:val="38"/>
   </w:num>
   <w:num w:numId="50" w16cid:durableId="764112343">
-    <w:abstractNumId w:val="61"/>
+    <w:abstractNumId w:val="62"/>
   </w:num>
   <w:num w:numId="51" w16cid:durableId="406271139">
     <w:abstractNumId w:val="4"/>
@@ -30037,16 +30876,16 @@
     <w:abstractNumId w:val="0"/>
   </w:num>
   <w:num w:numId="54" w16cid:durableId="1036344651">
-    <w:abstractNumId w:val="125"/>
+    <w:abstractNumId w:val="126"/>
   </w:num>
   <w:num w:numId="55" w16cid:durableId="1518470325">
-    <w:abstractNumId w:val="77"/>
+    <w:abstractNumId w:val="78"/>
   </w:num>
   <w:num w:numId="56" w16cid:durableId="1085567629">
     <w:abstractNumId w:val="13"/>
   </w:num>
   <w:num w:numId="57" w16cid:durableId="1284113319">
-    <w:abstractNumId w:val="93"/>
+    <w:abstractNumId w:val="94"/>
   </w:num>
   <w:num w:numId="58" w16cid:durableId="1203976368">
     <w:abstractNumId w:val="31"/>
@@ -30055,7 +30894,7 @@
     <w:abstractNumId w:val="17"/>
   </w:num>
   <w:num w:numId="60" w16cid:durableId="194273613">
-    <w:abstractNumId w:val="62"/>
+    <w:abstractNumId w:val="63"/>
   </w:num>
   <w:num w:numId="61" w16cid:durableId="73673214">
     <w:abstractNumId w:val="25"/>
@@ -30064,34 +30903,34 @@
     <w:abstractNumId w:val="32"/>
   </w:num>
   <w:num w:numId="63" w16cid:durableId="2068990151">
-    <w:abstractNumId w:val="110"/>
+    <w:abstractNumId w:val="111"/>
   </w:num>
   <w:num w:numId="64" w16cid:durableId="979110401">
-    <w:abstractNumId w:val="99"/>
+    <w:abstractNumId w:val="100"/>
   </w:num>
   <w:num w:numId="65" w16cid:durableId="133373549">
-    <w:abstractNumId w:val="94"/>
+    <w:abstractNumId w:val="95"/>
   </w:num>
   <w:num w:numId="66" w16cid:durableId="1610967260">
-    <w:abstractNumId w:val="79"/>
+    <w:abstractNumId w:val="80"/>
   </w:num>
   <w:num w:numId="67" w16cid:durableId="106510588">
     <w:abstractNumId w:val="43"/>
   </w:num>
   <w:num w:numId="68" w16cid:durableId="1565293163">
-    <w:abstractNumId w:val="56"/>
+    <w:abstractNumId w:val="57"/>
   </w:num>
   <w:num w:numId="69" w16cid:durableId="888608917">
     <w:abstractNumId w:val="6"/>
   </w:num>
   <w:num w:numId="70" w16cid:durableId="846410672">
-    <w:abstractNumId w:val="81"/>
+    <w:abstractNumId w:val="82"/>
   </w:num>
   <w:num w:numId="71" w16cid:durableId="324944699">
-    <w:abstractNumId w:val="100"/>
+    <w:abstractNumId w:val="101"/>
   </w:num>
   <w:num w:numId="72" w16cid:durableId="1939830067">
-    <w:abstractNumId w:val="106"/>
+    <w:abstractNumId w:val="107"/>
   </w:num>
   <w:num w:numId="73" w16cid:durableId="2096629661">
     <w:abstractNumId w:val="40"/>
@@ -30100,22 +30939,22 @@
     <w:abstractNumId w:val="26"/>
   </w:num>
   <w:num w:numId="75" w16cid:durableId="1054081341">
-    <w:abstractNumId w:val="104"/>
+    <w:abstractNumId w:val="105"/>
   </w:num>
   <w:num w:numId="76" w16cid:durableId="502360508">
     <w:abstractNumId w:val="34"/>
   </w:num>
   <w:num w:numId="77" w16cid:durableId="1029144370">
-    <w:abstractNumId w:val="73"/>
+    <w:abstractNumId w:val="74"/>
   </w:num>
   <w:num w:numId="78" w16cid:durableId="998339497">
-    <w:abstractNumId w:val="59"/>
+    <w:abstractNumId w:val="60"/>
   </w:num>
   <w:num w:numId="79" w16cid:durableId="1854176401">
     <w:abstractNumId w:val="41"/>
   </w:num>
   <w:num w:numId="80" w16cid:durableId="224800904">
-    <w:abstractNumId w:val="54"/>
+    <w:abstractNumId w:val="55"/>
   </w:num>
   <w:num w:numId="81" w16cid:durableId="1108501820">
     <w:abstractNumId w:val="3"/>
@@ -30124,70 +30963,70 @@
     <w:abstractNumId w:val="29"/>
   </w:num>
   <w:num w:numId="83" w16cid:durableId="1399355506">
-    <w:abstractNumId w:val="120"/>
+    <w:abstractNumId w:val="121"/>
   </w:num>
   <w:num w:numId="84" w16cid:durableId="1147163160">
     <w:abstractNumId w:val="35"/>
   </w:num>
   <w:num w:numId="85" w16cid:durableId="1150756153">
-    <w:abstractNumId w:val="118"/>
+    <w:abstractNumId w:val="119"/>
   </w:num>
   <w:num w:numId="86" w16cid:durableId="2111197635">
-    <w:abstractNumId w:val="68"/>
+    <w:abstractNumId w:val="69"/>
   </w:num>
   <w:num w:numId="87" w16cid:durableId="1764380006">
     <w:abstractNumId w:val="44"/>
   </w:num>
   <w:num w:numId="88" w16cid:durableId="548225956">
-    <w:abstractNumId w:val="78"/>
+    <w:abstractNumId w:val="79"/>
   </w:num>
   <w:num w:numId="89" w16cid:durableId="778988521">
-    <w:abstractNumId w:val="63"/>
+    <w:abstractNumId w:val="64"/>
   </w:num>
   <w:num w:numId="90" w16cid:durableId="54083153">
-    <w:abstractNumId w:val="51"/>
+    <w:abstractNumId w:val="52"/>
   </w:num>
   <w:num w:numId="91" w16cid:durableId="2042512412">
-    <w:abstractNumId w:val="92"/>
+    <w:abstractNumId w:val="93"/>
   </w:num>
   <w:num w:numId="92" w16cid:durableId="1881823123">
-    <w:abstractNumId w:val="102"/>
+    <w:abstractNumId w:val="103"/>
   </w:num>
   <w:num w:numId="93" w16cid:durableId="229464460">
-    <w:abstractNumId w:val="91"/>
+    <w:abstractNumId w:val="92"/>
   </w:num>
   <w:num w:numId="94" w16cid:durableId="1095709949">
     <w:abstractNumId w:val="33"/>
   </w:num>
   <w:num w:numId="95" w16cid:durableId="451705308">
-    <w:abstractNumId w:val="82"/>
+    <w:abstractNumId w:val="83"/>
   </w:num>
   <w:num w:numId="96" w16cid:durableId="268321459">
-    <w:abstractNumId w:val="86"/>
+    <w:abstractNumId w:val="87"/>
   </w:num>
   <w:num w:numId="97" w16cid:durableId="2001351340">
-    <w:abstractNumId w:val="95"/>
+    <w:abstractNumId w:val="96"/>
   </w:num>
   <w:num w:numId="98" w16cid:durableId="1514224579">
-    <w:abstractNumId w:val="126"/>
+    <w:abstractNumId w:val="127"/>
   </w:num>
   <w:num w:numId="99" w16cid:durableId="1973707524">
     <w:abstractNumId w:val="39"/>
   </w:num>
   <w:num w:numId="100" w16cid:durableId="1388266203">
-    <w:abstractNumId w:val="101"/>
+    <w:abstractNumId w:val="102"/>
   </w:num>
   <w:num w:numId="101" w16cid:durableId="1378432116">
-    <w:abstractNumId w:val="88"/>
+    <w:abstractNumId w:val="89"/>
   </w:num>
   <w:num w:numId="102" w16cid:durableId="716048228">
-    <w:abstractNumId w:val="122"/>
+    <w:abstractNumId w:val="123"/>
   </w:num>
   <w:num w:numId="103" w16cid:durableId="741832202">
     <w:abstractNumId w:val="46"/>
   </w:num>
   <w:num w:numId="104" w16cid:durableId="66459130">
-    <w:abstractNumId w:val="84"/>
+    <w:abstractNumId w:val="85"/>
   </w:num>
   <w:num w:numId="105" w16cid:durableId="344019374">
     <w:abstractNumId w:val="22"/>
@@ -30199,43 +31038,43 @@
     <w:abstractNumId w:val="2"/>
   </w:num>
   <w:num w:numId="108" w16cid:durableId="1388381537">
-    <w:abstractNumId w:val="121"/>
+    <w:abstractNumId w:val="122"/>
   </w:num>
   <w:num w:numId="109" w16cid:durableId="878005930">
     <w:abstractNumId w:val="42"/>
   </w:num>
   <w:num w:numId="110" w16cid:durableId="158547340">
-    <w:abstractNumId w:val="70"/>
+    <w:abstractNumId w:val="71"/>
   </w:num>
   <w:num w:numId="111" w16cid:durableId="356002018">
-    <w:abstractNumId w:val="65"/>
+    <w:abstractNumId w:val="66"/>
   </w:num>
   <w:num w:numId="112" w16cid:durableId="117451158">
-    <w:abstractNumId w:val="111"/>
+    <w:abstractNumId w:val="112"/>
   </w:num>
   <w:num w:numId="113" w16cid:durableId="2108497154">
     <w:abstractNumId w:val="10"/>
   </w:num>
   <w:num w:numId="114" w16cid:durableId="2067143046">
-    <w:abstractNumId w:val="119"/>
+    <w:abstractNumId w:val="120"/>
   </w:num>
   <w:num w:numId="115" w16cid:durableId="308558975">
-    <w:abstractNumId w:val="87"/>
+    <w:abstractNumId w:val="88"/>
   </w:num>
   <w:num w:numId="116" w16cid:durableId="1638341838">
     <w:abstractNumId w:val="36"/>
   </w:num>
   <w:num w:numId="117" w16cid:durableId="470096869">
-    <w:abstractNumId w:val="67"/>
+    <w:abstractNumId w:val="68"/>
   </w:num>
   <w:num w:numId="118" w16cid:durableId="1478064490">
     <w:abstractNumId w:val="7"/>
   </w:num>
   <w:num w:numId="119" w16cid:durableId="1379816464">
-    <w:abstractNumId w:val="52"/>
+    <w:abstractNumId w:val="53"/>
   </w:num>
   <w:num w:numId="120" w16cid:durableId="1446802373">
-    <w:abstractNumId w:val="85"/>
+    <w:abstractNumId w:val="86"/>
   </w:num>
   <w:num w:numId="121" w16cid:durableId="158009478">
     <w:abstractNumId w:val="47"/>
@@ -30244,34 +31083,40 @@
     <w:abstractNumId w:val="9"/>
   </w:num>
   <w:num w:numId="123" w16cid:durableId="12652454">
-    <w:abstractNumId w:val="69"/>
+    <w:abstractNumId w:val="70"/>
   </w:num>
   <w:num w:numId="124" w16cid:durableId="1160269763">
+    <w:abstractNumId w:val="116"/>
+  </w:num>
+  <w:num w:numId="125" w16cid:durableId="1359504721">
+    <w:abstractNumId w:val="110"/>
+  </w:num>
+  <w:num w:numId="126" w16cid:durableId="591817711">
+    <w:abstractNumId w:val="104"/>
+  </w:num>
+  <w:num w:numId="127" w16cid:durableId="1188370363">
     <w:abstractNumId w:val="115"/>
   </w:num>
-  <w:num w:numId="125" w16cid:durableId="1359504721">
-    <w:abstractNumId w:val="109"/>
-  </w:num>
-  <w:num w:numId="126" w16cid:durableId="591817711">
-    <w:abstractNumId w:val="103"/>
-  </w:num>
-  <w:num w:numId="127" w16cid:durableId="1188370363">
-    <w:abstractNumId w:val="114"/>
-  </w:num>
   <w:num w:numId="128" w16cid:durableId="1167673079">
-    <w:abstractNumId w:val="97"/>
+    <w:abstractNumId w:val="98"/>
   </w:num>
   <w:num w:numId="129" w16cid:durableId="1460538847">
-    <w:abstractNumId w:val="97"/>
+    <w:abstractNumId w:val="98"/>
   </w:num>
   <w:num w:numId="130" w16cid:durableId="436944466">
-    <w:abstractNumId w:val="97"/>
+    <w:abstractNumId w:val="98"/>
   </w:num>
   <w:num w:numId="131" w16cid:durableId="2003729590">
-    <w:abstractNumId w:val="97"/>
+    <w:abstractNumId w:val="98"/>
   </w:num>
   <w:num w:numId="132" w16cid:durableId="1899240447">
-    <w:abstractNumId w:val="97"/>
+    <w:abstractNumId w:val="98"/>
+  </w:num>
+  <w:num w:numId="133" w16cid:durableId="2106654927">
+    <w:abstractNumId w:val="50"/>
+  </w:num>
+  <w:num w:numId="134" w16cid:durableId="1612661504">
+    <w:abstractNumId w:val="98"/>
   </w:num>
 </w:numbering>
 </file>
@@ -30328,7 +31173,7 @@
     <w:lsdException w:name="footnote text" w:semiHidden="1" w:uiPriority="0" w:unhideWhenUsed="1"/>
     <w:lsdException w:name="annotation text" w:semiHidden="1" w:uiPriority="0" w:unhideWhenUsed="1"/>
     <w:lsdException w:name="header" w:semiHidden="1" w:uiPriority="0" w:unhideWhenUsed="1"/>
-    <w:lsdException w:name="footer" w:semiHidden="1" w:unhideWhenUsed="1"/>
+    <w:lsdException w:name="footer" w:semiHidden="1" w:uiPriority="0" w:unhideWhenUsed="1"/>
     <w:lsdException w:name="index heading" w:semiHidden="1" w:uiPriority="0" w:unhideWhenUsed="1"/>
     <w:lsdException w:name="caption" w:semiHidden="1" w:uiPriority="0" w:unhideWhenUsed="1" w:qFormat="1"/>
     <w:lsdException w:name="table of figures" w:semiHidden="1" w:uiPriority="0" w:unhideWhenUsed="1"/>
@@ -30676,7 +31521,7 @@
   <w:style w:type="paragraph" w:default="1" w:styleId="Normal">
     <w:name w:val="Normal"/>
     <w:qFormat/>
-    <w:rsid w:val="00EC1AC6"/>
+    <w:rsid w:val="006E0994"/>
     <w:pPr>
       <w:spacing w:before="120" w:after="0" w:line="240" w:lineRule="auto"/>
     </w:pPr>
@@ -30694,7 +31539,7 @@
     <w:next w:val="BodyText"/>
     <w:link w:val="Heading1Char"/>
     <w:qFormat/>
-    <w:rsid w:val="00EC1AC6"/>
+    <w:rsid w:val="006E0994"/>
     <w:pPr>
       <w:keepNext/>
       <w:numPr>
@@ -30722,9 +31567,13 @@
     <w:link w:val="Heading2Char"/>
     <w:autoRedefine/>
     <w:qFormat/>
-    <w:rsid w:val="00EC1AC6"/>
+    <w:rsid w:val="006E0994"/>
     <w:pPr>
       <w:keepNext/>
+      <w:numPr>
+        <w:ilvl w:val="1"/>
+        <w:numId w:val="45"/>
+      </w:numPr>
       <w:spacing w:before="240" w:after="120"/>
       <w:outlineLvl w:val="1"/>
     </w:pPr>
@@ -30745,7 +31594,7 @@
     <w:link w:val="Heading3Char"/>
     <w:autoRedefine/>
     <w:qFormat/>
-    <w:rsid w:val="00EC1AC6"/>
+    <w:rsid w:val="006E0994"/>
     <w:pPr>
       <w:keepNext/>
       <w:numPr>
@@ -30773,7 +31622,7 @@
     <w:link w:val="Heading4Char"/>
     <w:autoRedefine/>
     <w:qFormat/>
-    <w:rsid w:val="00EC1AC6"/>
+    <w:rsid w:val="006E0994"/>
     <w:pPr>
       <w:numPr>
         <w:ilvl w:val="3"/>
@@ -30801,7 +31650,7 @@
     <w:next w:val="BodyText"/>
     <w:link w:val="Heading5Char"/>
     <w:qFormat/>
-    <w:rsid w:val="00EC1AC6"/>
+    <w:rsid w:val="006E0994"/>
     <w:pPr>
       <w:keepNext/>
       <w:numPr>
@@ -30829,7 +31678,7 @@
     <w:next w:val="BodyText"/>
     <w:link w:val="Heading6Char"/>
     <w:qFormat/>
-    <w:rsid w:val="00EC1AC6"/>
+    <w:rsid w:val="006E0994"/>
     <w:pPr>
       <w:keepNext/>
       <w:numPr>
@@ -30856,7 +31705,7 @@
     <w:next w:val="BodyText"/>
     <w:link w:val="Heading7Char"/>
     <w:qFormat/>
-    <w:rsid w:val="00EC1AC6"/>
+    <w:rsid w:val="006E0994"/>
     <w:pPr>
       <w:keepNext/>
       <w:numPr>
@@ -30882,7 +31731,7 @@
     <w:next w:val="BodyText"/>
     <w:link w:val="Heading8Char"/>
     <w:qFormat/>
-    <w:rsid w:val="00EC1AC6"/>
+    <w:rsid w:val="006E0994"/>
     <w:pPr>
       <w:keepNext/>
       <w:numPr>
@@ -30908,7 +31757,7 @@
     <w:next w:val="BodyText"/>
     <w:link w:val="Heading9Char"/>
     <w:qFormat/>
-    <w:rsid w:val="00EC1AC6"/>
+    <w:rsid w:val="006E0994"/>
     <w:pPr>
       <w:keepNext/>
       <w:numPr>
@@ -30930,9 +31779,8 @@
   <w:style w:type="character" w:default="1" w:styleId="DefaultParagraphFont">
     <w:name w:val="Default Paragraph Font"/>
     <w:uiPriority w:val="1"/>
-    <w:semiHidden/>
     <w:unhideWhenUsed/>
-    <w:rsid w:val="00EC1AC6"/>
+    <w:rsid w:val="006E0994"/>
   </w:style>
   <w:style w:type="table" w:default="1" w:styleId="TableNormal">
     <w:name w:val="Normal Table"/>
@@ -30954,13 +31802,13 @@
     <w:uiPriority w:val="99"/>
     <w:semiHidden/>
     <w:unhideWhenUsed/>
-    <w:rsid w:val="00EC1AC6"/>
+    <w:rsid w:val="006E0994"/>
   </w:style>
   <w:style w:type="character" w:customStyle="1" w:styleId="Heading1Char">
     <w:name w:val="Heading 1 Char"/>
     <w:aliases w:val="H1 Char"/>
     <w:link w:val="Heading1"/>
-    <w:rsid w:val="00EC1AC6"/>
+    <w:rsid w:val="006E0994"/>
     <w:rPr>
       <w:rFonts w:ascii="Arial Narrow" w:eastAsia="Times New Roman" w:hAnsi="Arial Narrow" w:cs="Times New Roman"/>
       <w:b/>
@@ -31099,7 +31947,7 @@
     <w:next w:val="Subtitle"/>
     <w:link w:val="TitleChar"/>
     <w:qFormat/>
-    <w:rsid w:val="00EC1AC6"/>
+    <w:rsid w:val="006E0994"/>
     <w:pPr>
       <w:keepLines w:val="0"/>
       <w:pageBreakBefore/>
@@ -31135,7 +31983,7 @@
     <w:next w:val="BodyText"/>
     <w:link w:val="SubtitleChar"/>
     <w:qFormat/>
-    <w:rsid w:val="00EC1AC6"/>
+    <w:rsid w:val="006E0994"/>
     <w:pPr>
       <w:spacing w:after="240"/>
     </w:pPr>
@@ -31275,7 +32123,7 @@
   <w:style w:type="character" w:styleId="Hyperlink">
     <w:name w:val="Hyperlink"/>
     <w:uiPriority w:val="99"/>
-    <w:rsid w:val="00EC1AC6"/>
+    <w:rsid w:val="006E0994"/>
     <w:rPr>
       <w:color w:val="0000FF"/>
       <w:u w:val="single"/>
@@ -31283,7 +32131,7 @@
   </w:style>
   <w:style w:type="character" w:styleId="FollowedHyperlink">
     <w:name w:val="FollowedHyperlink"/>
-    <w:rsid w:val="00EC1AC6"/>
+    <w:rsid w:val="006E0994"/>
     <w:rPr>
       <w:color w:val="800080"/>
       <w:u w:val="single"/>
@@ -31292,7 +32140,7 @@
   <w:style w:type="character" w:styleId="Strong">
     <w:name w:val="Strong"/>
     <w:qFormat/>
-    <w:rsid w:val="00EC1AC6"/>
+    <w:rsid w:val="006E0994"/>
     <w:rPr>
       <w:b/>
       <w:bCs/>
@@ -31314,7 +32162,7 @@
   <w:style w:type="character" w:styleId="Emphasis">
     <w:name w:val="Emphasis"/>
     <w:qFormat/>
-    <w:rsid w:val="00EC1AC6"/>
+    <w:rsid w:val="006E0994"/>
     <w:rPr>
       <w:i/>
     </w:rPr>
@@ -31322,7 +32170,7 @@
   <w:style w:type="paragraph" w:styleId="NormalWeb">
     <w:name w:val="Normal (Web)"/>
     <w:basedOn w:val="Normal"/>
-    <w:rsid w:val="00EC1AC6"/>
+    <w:rsid w:val="006E0994"/>
     <w:pPr>
       <w:spacing w:before="100" w:beforeAutospacing="1" w:after="100" w:afterAutospacing="1"/>
     </w:pPr>
@@ -31335,7 +32183,7 @@
     <w:name w:val="HTML Preformatted"/>
     <w:basedOn w:val="Normal"/>
     <w:link w:val="HTMLPreformattedChar"/>
-    <w:rsid w:val="00EC1AC6"/>
+    <w:rsid w:val="006E0994"/>
     <w:pPr>
       <w:tabs>
         <w:tab w:val="left" w:pos="916"/>
@@ -31391,7 +32239,7 @@
   <w:style w:type="paragraph" w:customStyle="1" w:styleId="DocumentTitle">
     <w:name w:val="Document Title"/>
     <w:basedOn w:val="Normal"/>
-    <w:rsid w:val="00EC1AC6"/>
+    <w:rsid w:val="006E0994"/>
     <w:pPr>
       <w:tabs>
         <w:tab w:val="right" w:pos="8640"/>
@@ -31410,7 +32258,7 @@
   <w:style w:type="paragraph" w:customStyle="1" w:styleId="Tabletext">
     <w:name w:val="Tabletext"/>
     <w:basedOn w:val="Normal"/>
-    <w:rsid w:val="00EC1AC6"/>
+    <w:rsid w:val="006E0994"/>
     <w:pPr>
       <w:keepLines/>
       <w:widowControl w:val="0"/>
@@ -31423,7 +32271,7 @@
   <w:style w:type="table" w:styleId="TableGrid">
     <w:name w:val="Table Grid"/>
     <w:basedOn w:val="TableNormal"/>
-    <w:rsid w:val="00EC1AC6"/>
+    <w:rsid w:val="006E0994"/>
     <w:pPr>
       <w:spacing w:after="0" w:line="240" w:lineRule="auto"/>
     </w:pPr>
@@ -31450,7 +32298,7 @@
     <w:aliases w:val="Body Text Plain,Doors Normal"/>
     <w:basedOn w:val="Normal"/>
     <w:link w:val="BodyTextChar"/>
-    <w:rsid w:val="00EC1AC6"/>
+    <w:rsid w:val="006E0994"/>
     <w:pPr>
       <w:tabs>
         <w:tab w:val="right" w:pos="8640"/>
@@ -31466,7 +32314,7 @@
     <w:name w:val="Body Text Char"/>
     <w:aliases w:val="Body Text Plain Char,Doors Normal Char"/>
     <w:link w:val="BodyText"/>
-    <w:rsid w:val="00EC1AC6"/>
+    <w:rsid w:val="006E0994"/>
     <w:rPr>
       <w:rFonts w:ascii="Arial Narrow" w:eastAsia="Times New Roman" w:hAnsi="Arial Narrow" w:cs="Times New Roman"/>
       <w:spacing w:val="4"/>
@@ -31479,7 +32327,7 @@
   <w:style w:type="paragraph" w:customStyle="1" w:styleId="Author">
     <w:name w:val="Author"/>
     <w:basedOn w:val="BodyText"/>
-    <w:rsid w:val="00EC1AC6"/>
+    <w:rsid w:val="006E0994"/>
     <w:pPr>
       <w:spacing w:line="480" w:lineRule="auto"/>
       <w:jc w:val="center"/>
@@ -31488,7 +32336,7 @@
   <w:style w:type="paragraph" w:customStyle="1" w:styleId="BlockQuotation">
     <w:name w:val="Block Quotation"/>
     <w:basedOn w:val="BodyText"/>
-    <w:rsid w:val="00EC1AC6"/>
+    <w:rsid w:val="006E0994"/>
     <w:pPr>
       <w:keepLines/>
       <w:spacing w:after="160" w:line="480" w:lineRule="auto"/>
@@ -31503,7 +32351,7 @@
     <w:basedOn w:val="Normal"/>
     <w:next w:val="BodyText"/>
     <w:qFormat/>
-    <w:rsid w:val="00EC1AC6"/>
+    <w:rsid w:val="006E0994"/>
     <w:pPr>
       <w:tabs>
         <w:tab w:val="right" w:pos="8640"/>
@@ -31523,7 +32371,7 @@
     <w:name w:val="Date"/>
     <w:basedOn w:val="BodyText"/>
     <w:link w:val="DateChar"/>
-    <w:rsid w:val="00EC1AC6"/>
+    <w:rsid w:val="006E0994"/>
     <w:pPr>
       <w:spacing w:after="560"/>
       <w:jc w:val="center"/>
@@ -31546,7 +32394,7 @@
   <w:style w:type="character" w:styleId="EndnoteReference">
     <w:name w:val="endnote reference"/>
     <w:semiHidden/>
-    <w:rsid w:val="00EC1AC6"/>
+    <w:rsid w:val="006E0994"/>
     <w:rPr>
       <w:vertAlign w:val="superscript"/>
     </w:rPr>
@@ -31555,8 +32403,7 @@
     <w:name w:val="footer"/>
     <w:basedOn w:val="Normal"/>
     <w:link w:val="FooterChar"/>
-    <w:uiPriority w:val="99"/>
-    <w:rsid w:val="00EC1AC6"/>
+    <w:rsid w:val="006E0994"/>
     <w:pPr>
       <w:keepLines/>
       <w:tabs>
@@ -31575,7 +32422,6 @@
     <w:name w:val="Footer Char"/>
     <w:basedOn w:val="DefaultParagraphFont"/>
     <w:link w:val="Footer"/>
-    <w:uiPriority w:val="99"/>
     <w:rsid w:val="00B34FB5"/>
     <w:rPr>
       <w:rFonts w:ascii="Arial Narrow" w:eastAsia="Times New Roman" w:hAnsi="Arial Narrow" w:cs="Times New Roman"/>
@@ -31589,12 +32435,12 @@
   <w:style w:type="paragraph" w:customStyle="1" w:styleId="FooterEven">
     <w:name w:val="Footer Even"/>
     <w:basedOn w:val="Footer"/>
-    <w:rsid w:val="00EC1AC6"/>
+    <w:rsid w:val="006E0994"/>
   </w:style>
   <w:style w:type="paragraph" w:customStyle="1" w:styleId="FooterFirst">
     <w:name w:val="Footer First"/>
     <w:basedOn w:val="Footer"/>
-    <w:rsid w:val="00EC1AC6"/>
+    <w:rsid w:val="006E0994"/>
     <w:pPr>
       <w:tabs>
         <w:tab w:val="clear" w:pos="8640"/>
@@ -31604,7 +32450,7 @@
   <w:style w:type="paragraph" w:customStyle="1" w:styleId="FooterOdd">
     <w:name w:val="Footer Odd"/>
     <w:basedOn w:val="Footer"/>
-    <w:rsid w:val="00EC1AC6"/>
+    <w:rsid w:val="006E0994"/>
     <w:pPr>
       <w:tabs>
         <w:tab w:val="right" w:pos="0"/>
@@ -31614,7 +32460,7 @@
   <w:style w:type="paragraph" w:customStyle="1" w:styleId="FootnoteBase">
     <w:name w:val="Footnote Base"/>
     <w:basedOn w:val="Normal"/>
-    <w:rsid w:val="00EC1AC6"/>
+    <w:rsid w:val="006E0994"/>
     <w:pPr>
       <w:tabs>
         <w:tab w:val="left" w:pos="187"/>
@@ -31633,7 +32479,7 @@
   <w:style w:type="character" w:styleId="FootnoteReference">
     <w:name w:val="footnote reference"/>
     <w:semiHidden/>
-    <w:rsid w:val="00EC1AC6"/>
+    <w:rsid w:val="006E0994"/>
     <w:rPr>
       <w:vertAlign w:val="superscript"/>
     </w:rPr>
@@ -31643,7 +32489,7 @@
     <w:basedOn w:val="FootnoteBase"/>
     <w:link w:val="FootnoteTextChar"/>
     <w:semiHidden/>
-    <w:rsid w:val="00EC1AC6"/>
+    <w:rsid w:val="006E0994"/>
     <w:pPr>
       <w:spacing w:after="120"/>
     </w:pPr>
@@ -31666,7 +32512,7 @@
   <w:style w:type="paragraph" w:customStyle="1" w:styleId="GlossaryDefinition">
     <w:name w:val="Glossary Definition"/>
     <w:basedOn w:val="BodyText"/>
-    <w:rsid w:val="00EC1AC6"/>
+    <w:rsid w:val="006E0994"/>
     <w:pPr>
       <w:tabs>
         <w:tab w:val="clear" w:pos="8640"/>
@@ -31676,7 +32522,7 @@
   </w:style>
   <w:style w:type="character" w:customStyle="1" w:styleId="GlossaryEntry">
     <w:name w:val="Glossary Entry"/>
-    <w:rsid w:val="00EC1AC6"/>
+    <w:rsid w:val="006E0994"/>
     <w:rPr>
       <w:b/>
       <w:bCs/>
@@ -31687,7 +32533,7 @@
     <w:name w:val="Heading Base"/>
     <w:basedOn w:val="Normal"/>
     <w:next w:val="BodyText"/>
-    <w:rsid w:val="00EC1AC6"/>
+    <w:rsid w:val="006E0994"/>
     <w:pPr>
       <w:keepNext/>
       <w:keepLines/>
@@ -31708,7 +32554,7 @@
     <w:basedOn w:val="Normal"/>
     <w:autoRedefine/>
     <w:semiHidden/>
-    <w:rsid w:val="00EC1AC6"/>
+    <w:rsid w:val="006E0994"/>
     <w:pPr>
       <w:spacing w:before="0"/>
       <w:ind w:left="220" w:hanging="220"/>
@@ -31722,7 +32568,7 @@
     <w:basedOn w:val="Normal"/>
     <w:autoRedefine/>
     <w:semiHidden/>
-    <w:rsid w:val="00EC1AC6"/>
+    <w:rsid w:val="006E0994"/>
     <w:pPr>
       <w:spacing w:before="0"/>
       <w:ind w:left="440" w:hanging="220"/>
@@ -31736,7 +32582,7 @@
     <w:basedOn w:val="Normal"/>
     <w:autoRedefine/>
     <w:semiHidden/>
-    <w:rsid w:val="00EC1AC6"/>
+    <w:rsid w:val="006E0994"/>
     <w:pPr>
       <w:spacing w:before="0"/>
       <w:ind w:left="660" w:hanging="220"/>
@@ -31750,7 +32596,7 @@
     <w:basedOn w:val="Normal"/>
     <w:autoRedefine/>
     <w:semiHidden/>
-    <w:rsid w:val="00EC1AC6"/>
+    <w:rsid w:val="006E0994"/>
     <w:pPr>
       <w:spacing w:before="0"/>
       <w:ind w:left="880" w:hanging="220"/>
@@ -31765,7 +32611,7 @@
     <w:basedOn w:val="Normal"/>
     <w:autoRedefine/>
     <w:semiHidden/>
-    <w:rsid w:val="00EC1AC6"/>
+    <w:rsid w:val="006E0994"/>
     <w:pPr>
       <w:spacing w:before="0"/>
       <w:ind w:left="1100" w:hanging="220"/>
@@ -31778,7 +32624,7 @@
   <w:style w:type="paragraph" w:customStyle="1" w:styleId="IndexBase">
     <w:name w:val="Index Base"/>
     <w:basedOn w:val="Normal"/>
-    <w:rsid w:val="00EC1AC6"/>
+    <w:rsid w:val="006E0994"/>
     <w:pPr>
       <w:tabs>
         <w:tab w:val="right" w:leader="dot" w:pos="3960"/>
@@ -31798,7 +32644,7 @@
     <w:next w:val="Index1"/>
     <w:autoRedefine/>
     <w:semiHidden/>
-    <w:rsid w:val="00EC1AC6"/>
+    <w:rsid w:val="006E0994"/>
     <w:pPr>
       <w:spacing w:before="240" w:after="120"/>
       <w:ind w:left="216"/>
@@ -31812,7 +32658,7 @@
   </w:style>
   <w:style w:type="character" w:customStyle="1" w:styleId="Lead-inEmphasis">
     <w:name w:val="Lead-in Emphasis"/>
-    <w:rsid w:val="00EC1AC6"/>
+    <w:rsid w:val="006E0994"/>
     <w:rPr>
       <w:rFonts w:ascii="Arial Narrow" w:hAnsi="Arial Narrow"/>
       <w:caps/>
@@ -31821,12 +32667,12 @@
   </w:style>
   <w:style w:type="character" w:styleId="LineNumber">
     <w:name w:val="line number"/>
-    <w:rsid w:val="00EC1AC6"/>
+    <w:rsid w:val="006E0994"/>
   </w:style>
   <w:style w:type="paragraph" w:styleId="List">
     <w:name w:val="List"/>
     <w:basedOn w:val="BodyText"/>
-    <w:rsid w:val="00EC1AC6"/>
+    <w:rsid w:val="006E0994"/>
     <w:pPr>
       <w:tabs>
         <w:tab w:val="left" w:pos="720"/>
@@ -31838,7 +32684,7 @@
   <w:style w:type="paragraph" w:styleId="List2">
     <w:name w:val="List 2"/>
     <w:basedOn w:val="List"/>
-    <w:rsid w:val="00EC1AC6"/>
+    <w:rsid w:val="006E0994"/>
     <w:pPr>
       <w:tabs>
         <w:tab w:val="clear" w:pos="720"/>
@@ -31850,7 +32696,7 @@
   <w:style w:type="paragraph" w:styleId="List3">
     <w:name w:val="List 3"/>
     <w:basedOn w:val="List"/>
-    <w:rsid w:val="00EC1AC6"/>
+    <w:rsid w:val="006E0994"/>
     <w:pPr>
       <w:tabs>
         <w:tab w:val="clear" w:pos="720"/>
@@ -31862,7 +32708,7 @@
   <w:style w:type="paragraph" w:styleId="List4">
     <w:name w:val="List 4"/>
     <w:basedOn w:val="List"/>
-    <w:rsid w:val="00EC1AC6"/>
+    <w:rsid w:val="006E0994"/>
     <w:pPr>
       <w:tabs>
         <w:tab w:val="clear" w:pos="720"/>
@@ -31874,7 +32720,7 @@
   <w:style w:type="paragraph" w:styleId="List5">
     <w:name w:val="List 5"/>
     <w:basedOn w:val="List"/>
-    <w:rsid w:val="00EC1AC6"/>
+    <w:rsid w:val="006E0994"/>
     <w:pPr>
       <w:tabs>
         <w:tab w:val="clear" w:pos="720"/>
@@ -31886,7 +32732,7 @@
   <w:style w:type="paragraph" w:styleId="ListNumber">
     <w:name w:val="List Number"/>
     <w:basedOn w:val="List"/>
-    <w:rsid w:val="00EC1AC6"/>
+    <w:rsid w:val="006E0994"/>
     <w:pPr>
       <w:tabs>
         <w:tab w:val="clear" w:pos="720"/>
@@ -31900,7 +32746,7 @@
   <w:style w:type="paragraph" w:styleId="ListNumber2">
     <w:name w:val="List Number 2"/>
     <w:basedOn w:val="ListNumber"/>
-    <w:rsid w:val="00EC1AC6"/>
+    <w:rsid w:val="006E0994"/>
     <w:pPr>
       <w:ind w:left="360"/>
     </w:pPr>
@@ -31908,7 +32754,7 @@
   <w:style w:type="paragraph" w:styleId="ListNumber3">
     <w:name w:val="List Number 3"/>
     <w:basedOn w:val="ListNumber"/>
-    <w:rsid w:val="00EC1AC6"/>
+    <w:rsid w:val="006E0994"/>
     <w:pPr>
       <w:ind w:left="720"/>
     </w:pPr>
@@ -31916,7 +32762,7 @@
   <w:style w:type="paragraph" w:styleId="ListNumber4">
     <w:name w:val="List Number 4"/>
     <w:basedOn w:val="ListNumber"/>
-    <w:rsid w:val="00EC1AC6"/>
+    <w:rsid w:val="006E0994"/>
     <w:pPr>
       <w:ind w:left="1080"/>
     </w:pPr>
@@ -31924,7 +32770,7 @@
   <w:style w:type="paragraph" w:styleId="ListNumber5">
     <w:name w:val="List Number 5"/>
     <w:basedOn w:val="ListNumber"/>
-    <w:rsid w:val="00EC1AC6"/>
+    <w:rsid w:val="006E0994"/>
     <w:pPr>
       <w:ind w:left="1440"/>
     </w:pPr>
@@ -31934,7 +32780,7 @@
     <w:basedOn w:val="BodyText"/>
     <w:link w:val="MacroTextChar"/>
     <w:semiHidden/>
-    <w:rsid w:val="00EC1AC6"/>
+    <w:rsid w:val="006E0994"/>
     <w:pPr>
       <w:spacing w:after="120"/>
     </w:pPr>
@@ -31960,20 +32806,20 @@
   <w:style w:type="paragraph" w:customStyle="1" w:styleId="Name">
     <w:name w:val="Name"/>
     <w:basedOn w:val="BodyText"/>
-    <w:rsid w:val="00EC1AC6"/>
+    <w:rsid w:val="006E0994"/>
     <w:pPr>
       <w:jc w:val="center"/>
     </w:pPr>
   </w:style>
   <w:style w:type="character" w:styleId="PageNumber">
     <w:name w:val="page number"/>
-    <w:rsid w:val="00EC1AC6"/>
+    <w:rsid w:val="006E0994"/>
   </w:style>
   <w:style w:type="paragraph" w:customStyle="1" w:styleId="Picture">
     <w:name w:val="Picture"/>
     <w:basedOn w:val="BodyText"/>
     <w:next w:val="Caption"/>
-    <w:rsid w:val="00EC1AC6"/>
+    <w:rsid w:val="006E0994"/>
     <w:pPr>
       <w:keepNext/>
       <w:jc w:val="center"/>
@@ -31981,7 +32827,7 @@
   </w:style>
   <w:style w:type="character" w:customStyle="1" w:styleId="Superscript">
     <w:name w:val="Superscript"/>
-    <w:rsid w:val="00EC1AC6"/>
+    <w:rsid w:val="006E0994"/>
     <w:rPr>
       <w:vertAlign w:val="superscript"/>
     </w:rPr>
@@ -31990,7 +32836,7 @@
     <w:name w:val="table of figures"/>
     <w:basedOn w:val="Normal"/>
     <w:semiHidden/>
-    <w:rsid w:val="00EC1AC6"/>
+    <w:rsid w:val="006E0994"/>
     <w:pPr>
       <w:tabs>
         <w:tab w:val="right" w:leader="dot" w:pos="8640"/>
@@ -32008,7 +32854,7 @@
     <w:basedOn w:val="Normal"/>
     <w:next w:val="Normal"/>
     <w:semiHidden/>
-    <w:rsid w:val="00EC1AC6"/>
+    <w:rsid w:val="006E0994"/>
     <w:pPr>
       <w:keepNext/>
       <w:keepLines/>
@@ -32029,7 +32875,7 @@
     <w:basedOn w:val="Normal"/>
     <w:autoRedefine/>
     <w:uiPriority w:val="39"/>
-    <w:rsid w:val="00EC1AC6"/>
+    <w:rsid w:val="006E0994"/>
     <w:pPr>
       <w:spacing w:after="120"/>
     </w:pPr>
@@ -32047,7 +32893,7 @@
     <w:basedOn w:val="Normal"/>
     <w:autoRedefine/>
     <w:uiPriority w:val="39"/>
-    <w:rsid w:val="00EC1AC6"/>
+    <w:rsid w:val="006E0994"/>
     <w:pPr>
       <w:spacing w:before="0"/>
       <w:ind w:left="220"/>
@@ -32064,7 +32910,7 @@
     <w:basedOn w:val="Normal"/>
     <w:autoRedefine/>
     <w:uiPriority w:val="39"/>
-    <w:rsid w:val="00EC1AC6"/>
+    <w:rsid w:val="006E0994"/>
     <w:pPr>
       <w:spacing w:before="0"/>
       <w:ind w:left="440"/>
@@ -32082,7 +32928,7 @@
     <w:basedOn w:val="Normal"/>
     <w:autoRedefine/>
     <w:uiPriority w:val="39"/>
-    <w:rsid w:val="00EC1AC6"/>
+    <w:rsid w:val="006E0994"/>
     <w:pPr>
       <w:spacing w:before="0"/>
       <w:ind w:left="660"/>
@@ -32098,7 +32944,7 @@
     <w:basedOn w:val="Normal"/>
     <w:autoRedefine/>
     <w:semiHidden/>
-    <w:rsid w:val="00EC1AC6"/>
+    <w:rsid w:val="006E0994"/>
     <w:pPr>
       <w:spacing w:before="0"/>
       <w:ind w:left="880"/>
@@ -32112,7 +32958,7 @@
   <w:style w:type="paragraph" w:customStyle="1" w:styleId="TOCBase">
     <w:name w:val="TOC Base"/>
     <w:basedOn w:val="Normal"/>
-    <w:rsid w:val="00EC1AC6"/>
+    <w:rsid w:val="006E0994"/>
     <w:pPr>
       <w:tabs>
         <w:tab w:val="right" w:leader="dot" w:pos="8640"/>
@@ -32128,7 +32974,7 @@
     <w:name w:val="header"/>
     <w:basedOn w:val="Normal"/>
     <w:link w:val="HeaderChar"/>
-    <w:rsid w:val="00EC1AC6"/>
+    <w:rsid w:val="006E0994"/>
     <w:pPr>
       <w:tabs>
         <w:tab w:val="center" w:pos="4320"/>
@@ -32161,7 +33007,7 @@
     <w:name w:val="Subtitle Cover"/>
     <w:basedOn w:val="TitleCover"/>
     <w:next w:val="BodyText"/>
-    <w:rsid w:val="00EC1AC6"/>
+    <w:rsid w:val="006E0994"/>
     <w:pPr>
       <w:spacing w:before="240"/>
     </w:pPr>
@@ -32175,7 +33021,7 @@
     <w:name w:val="Title Cover"/>
     <w:basedOn w:val="HeadingBase"/>
     <w:next w:val="SubtitleCover"/>
-    <w:rsid w:val="00EC1AC6"/>
+    <w:rsid w:val="006E0994"/>
     <w:pPr>
       <w:keepLines w:val="0"/>
       <w:tabs>
@@ -32195,7 +33041,7 @@
     <w:name w:val="Section Label"/>
     <w:basedOn w:val="HeadingBase"/>
     <w:next w:val="BodyText"/>
-    <w:rsid w:val="00EC1AC6"/>
+    <w:rsid w:val="006E0994"/>
     <w:pPr>
       <w:pageBreakBefore/>
       <w:tabs>
@@ -32214,7 +33060,7 @@
   <w:style w:type="character" w:styleId="CommentReference">
     <w:name w:val="annotation reference"/>
     <w:semiHidden/>
-    <w:rsid w:val="00EC1AC6"/>
+    <w:rsid w:val="006E0994"/>
     <w:rPr>
       <w:sz w:val="16"/>
       <w:szCs w:val="16"/>
@@ -32225,7 +33071,7 @@
     <w:basedOn w:val="Normal"/>
     <w:link w:val="CommentTextChar"/>
     <w:semiHidden/>
-    <w:rsid w:val="00EC1AC6"/>
+    <w:rsid w:val="006E0994"/>
     <w:rPr>
       <w:sz w:val="20"/>
       <w:szCs w:val="20"/>
@@ -32248,7 +33094,7 @@
   <w:style w:type="paragraph" w:customStyle="1" w:styleId="Paragraph2">
     <w:name w:val="Paragraph2"/>
     <w:basedOn w:val="Normal"/>
-    <w:rsid w:val="00EC1AC6"/>
+    <w:rsid w:val="006E0994"/>
     <w:pPr>
       <w:widowControl w:val="0"/>
       <w:spacing w:before="80" w:line="240" w:lineRule="atLeast"/>
@@ -32265,7 +33111,7 @@
   <w:style w:type="paragraph" w:customStyle="1" w:styleId="Paragraph4">
     <w:name w:val="Paragraph4"/>
     <w:basedOn w:val="Normal"/>
-    <w:rsid w:val="00EC1AC6"/>
+    <w:rsid w:val="006E0994"/>
     <w:pPr>
       <w:widowControl w:val="0"/>
       <w:spacing w:before="80"/>
@@ -32283,7 +33129,7 @@
     <w:next w:val="Normal"/>
     <w:autoRedefine/>
     <w:semiHidden/>
-    <w:rsid w:val="00EC1AC6"/>
+    <w:rsid w:val="006E0994"/>
     <w:pPr>
       <w:spacing w:before="0"/>
       <w:ind w:left="1100"/>
@@ -32300,7 +33146,7 @@
     <w:next w:val="Normal"/>
     <w:autoRedefine/>
     <w:semiHidden/>
-    <w:rsid w:val="00EC1AC6"/>
+    <w:rsid w:val="006E0994"/>
     <w:pPr>
       <w:spacing w:before="0"/>
       <w:ind w:left="1320"/>
@@ -32317,7 +33163,7 @@
     <w:next w:val="Normal"/>
     <w:autoRedefine/>
     <w:semiHidden/>
-    <w:rsid w:val="00EC1AC6"/>
+    <w:rsid w:val="006E0994"/>
     <w:pPr>
       <w:spacing w:before="0"/>
       <w:ind w:left="1540"/>
@@ -32334,7 +33180,7 @@
     <w:next w:val="Normal"/>
     <w:autoRedefine/>
     <w:semiHidden/>
-    <w:rsid w:val="00EC1AC6"/>
+    <w:rsid w:val="006E0994"/>
     <w:pPr>
       <w:spacing w:before="0"/>
       <w:ind w:left="1760"/>
@@ -32350,7 +33196,7 @@
     <w:basedOn w:val="Normal"/>
     <w:link w:val="DocumentMapChar"/>
     <w:semiHidden/>
-    <w:rsid w:val="00EC1AC6"/>
+    <w:rsid w:val="006E0994"/>
     <w:pPr>
       <w:shd w:val="clear" w:color="auto" w:fill="000080"/>
     </w:pPr>
@@ -32378,7 +33224,7 @@
     <w:next w:val="Normal"/>
     <w:autoRedefine/>
     <w:semiHidden/>
-    <w:rsid w:val="00EC1AC6"/>
+    <w:rsid w:val="006E0994"/>
     <w:pPr>
       <w:spacing w:before="0"/>
       <w:ind w:left="1320" w:hanging="220"/>
@@ -32394,7 +33240,7 @@
     <w:next w:val="Normal"/>
     <w:autoRedefine/>
     <w:semiHidden/>
-    <w:rsid w:val="00EC1AC6"/>
+    <w:rsid w:val="006E0994"/>
     <w:pPr>
       <w:spacing w:before="0"/>
       <w:ind w:left="1540" w:hanging="220"/>
@@ -32410,7 +33256,7 @@
     <w:next w:val="Normal"/>
     <w:autoRedefine/>
     <w:semiHidden/>
-    <w:rsid w:val="00EC1AC6"/>
+    <w:rsid w:val="006E0994"/>
     <w:pPr>
       <w:spacing w:before="0"/>
       <w:ind w:left="1760" w:hanging="220"/>
@@ -32426,7 +33272,7 @@
     <w:next w:val="Normal"/>
     <w:autoRedefine/>
     <w:semiHidden/>
-    <w:rsid w:val="00EC1AC6"/>
+    <w:rsid w:val="006E0994"/>
     <w:pPr>
       <w:spacing w:before="0"/>
       <w:ind w:left="1980" w:hanging="220"/>
@@ -32439,7 +33285,7 @@
   <w:style w:type="paragraph" w:customStyle="1" w:styleId="infoblue">
     <w:name w:val="infoblue"/>
     <w:basedOn w:val="Normal"/>
-    <w:rsid w:val="00EC1AC6"/>
+    <w:rsid w:val="006E0994"/>
     <w:pPr>
       <w:spacing w:before="0" w:after="120" w:line="240" w:lineRule="atLeast"/>
     </w:pPr>
@@ -32457,7 +33303,7 @@
     <w:basedOn w:val="Normal"/>
     <w:next w:val="BodyText"/>
     <w:autoRedefine/>
-    <w:rsid w:val="00EC1AC6"/>
+    <w:rsid w:val="006E0994"/>
     <w:pPr>
       <w:widowControl w:val="0"/>
     </w:pPr>
@@ -32470,7 +33316,7 @@
   <w:style w:type="paragraph" w:customStyle="1" w:styleId="ParagonSectionLabel">
     <w:name w:val="Paragon Section Label"/>
     <w:basedOn w:val="Normal"/>
-    <w:rsid w:val="00EC1AC6"/>
+    <w:rsid w:val="006E0994"/>
     <w:pPr>
       <w:spacing w:before="240" w:after="360"/>
       <w:jc w:val="center"/>
@@ -32483,7 +33329,7 @@
   <w:style w:type="paragraph" w:customStyle="1" w:styleId="tableright">
     <w:name w:val="table_right"/>
     <w:basedOn w:val="Normal"/>
-    <w:rsid w:val="00EC1AC6"/>
+    <w:rsid w:val="006E0994"/>
     <w:pPr>
       <w:spacing w:before="20" w:after="20" w:line="240" w:lineRule="exact"/>
     </w:pPr>
@@ -32496,7 +33342,7 @@
   <w:style w:type="paragraph" w:customStyle="1" w:styleId="numlist">
     <w:name w:val="numlist"/>
     <w:basedOn w:val="Normal"/>
-    <w:rsid w:val="00EC1AC6"/>
+    <w:rsid w:val="006E0994"/>
     <w:pPr>
       <w:ind w:left="342"/>
     </w:pPr>
@@ -32504,7 +33350,7 @@
   <w:style w:type="paragraph" w:customStyle="1" w:styleId="tablenumlist">
     <w:name w:val="table numlist"/>
     <w:basedOn w:val="Heading1"/>
-    <w:rsid w:val="00EC1AC6"/>
+    <w:rsid w:val="006E0994"/>
     <w:pPr>
       <w:keepNext w:val="0"/>
       <w:numPr>
@@ -32527,7 +33373,7 @@
   <w:style w:type="paragraph" w:customStyle="1" w:styleId="Normal1">
     <w:name w:val="Normal1"/>
     <w:basedOn w:val="Normal"/>
-    <w:rsid w:val="00EC1AC6"/>
+    <w:rsid w:val="006E0994"/>
     <w:pPr>
       <w:spacing w:before="60" w:after="120"/>
       <w:ind w:left="720"/>
@@ -32541,7 +33387,7 @@
     <w:name w:val="Bullet 1"/>
     <w:basedOn w:val="BodyText"/>
     <w:link w:val="Bullet1Char"/>
-    <w:rsid w:val="00EC1AC6"/>
+    <w:rsid w:val="006E0994"/>
     <w:pPr>
       <w:numPr>
         <w:numId w:val="47"/>
@@ -32552,7 +33398,7 @@
     <w:name w:val="Bullet 2"/>
     <w:basedOn w:val="BodyText"/>
     <w:link w:val="Bullet2Char"/>
-    <w:rsid w:val="00EC1AC6"/>
+    <w:rsid w:val="006E0994"/>
     <w:pPr>
       <w:numPr>
         <w:numId w:val="51"/>
@@ -32563,7 +33409,7 @@
     <w:name w:val="Bullet 3"/>
     <w:basedOn w:val="BodyText"/>
     <w:link w:val="Bullet3Char"/>
-    <w:rsid w:val="00EC1AC6"/>
+    <w:rsid w:val="006E0994"/>
     <w:pPr>
       <w:numPr>
         <w:numId w:val="49"/>
@@ -32573,7 +33419,7 @@
   <w:style w:type="paragraph" w:customStyle="1" w:styleId="NumberList">
     <w:name w:val="NumberList"/>
     <w:basedOn w:val="Normal"/>
-    <w:rsid w:val="00EC1AC6"/>
+    <w:rsid w:val="006E0994"/>
     <w:pPr>
       <w:overflowPunct w:val="0"/>
       <w:autoSpaceDE w:val="0"/>
@@ -32592,7 +33438,7 @@
   <w:style w:type="paragraph" w:customStyle="1" w:styleId="Bullet4">
     <w:name w:val="Bullet 4"/>
     <w:basedOn w:val="BodyText"/>
-    <w:rsid w:val="00EC1AC6"/>
+    <w:rsid w:val="006E0994"/>
     <w:pPr>
       <w:numPr>
         <w:numId w:val="50"/>
@@ -32602,7 +33448,7 @@
   <w:style w:type="paragraph" w:customStyle="1" w:styleId="Bullet5">
     <w:name w:val="Bullet 5"/>
     <w:basedOn w:val="BodyText"/>
-    <w:rsid w:val="00EC1AC6"/>
+    <w:rsid w:val="006E0994"/>
     <w:pPr>
       <w:numPr>
         <w:numId w:val="48"/>
@@ -32612,7 +33458,7 @@
   <w:style w:type="paragraph" w:customStyle="1" w:styleId="TableContent">
     <w:name w:val="Table Content"/>
     <w:basedOn w:val="BodyText"/>
-    <w:rsid w:val="00EC1AC6"/>
+    <w:rsid w:val="006E0994"/>
     <w:pPr>
       <w:keepLines/>
       <w:tabs>
@@ -32630,7 +33476,7 @@
   <w:style w:type="paragraph" w:styleId="ListBullet">
     <w:name w:val="List Bullet"/>
     <w:basedOn w:val="Normal"/>
-    <w:rsid w:val="00EC1AC6"/>
+    <w:rsid w:val="006E0994"/>
     <w:pPr>
       <w:numPr>
         <w:numId w:val="43"/>
@@ -32646,14 +33492,14 @@
     <w:name w:val="term"/>
     <w:basedOn w:val="ListBullet"/>
     <w:next w:val="Normal"/>
-    <w:rsid w:val="00EC1AC6"/>
+    <w:rsid w:val="006E0994"/>
     <w:pPr>
       <w:spacing w:before="120"/>
     </w:pPr>
   </w:style>
   <w:style w:type="paragraph" w:customStyle="1" w:styleId="list-bullet-level-2">
     <w:name w:val="list-bullet-level-2"/>
-    <w:rsid w:val="00EC1AC6"/>
+    <w:rsid w:val="006E0994"/>
     <w:pPr>
       <w:numPr>
         <w:numId w:val="52"/>
@@ -32679,7 +33525,7 @@
   <w:style w:type="paragraph" w:customStyle="1" w:styleId="list-bullet-level-2-border">
     <w:name w:val="list-bullet-level-2-border"/>
     <w:basedOn w:val="list-bullet-level-2"/>
-    <w:rsid w:val="00EC1AC6"/>
+    <w:rsid w:val="006E0994"/>
     <w:pPr>
       <w:keepNext/>
       <w:keepLines/>
@@ -32700,7 +33546,7 @@
     <w:basedOn w:val="Normal"/>
     <w:link w:val="BalloonTextChar"/>
     <w:semiHidden/>
-    <w:rsid w:val="00EC1AC6"/>
+    <w:rsid w:val="006E0994"/>
     <w:rPr>
       <w:rFonts w:ascii="Tahoma" w:hAnsi="Tahoma" w:cs="Tahoma"/>
       <w:sz w:val="16"/>
@@ -32724,7 +33570,7 @@
   <w:style w:type="paragraph" w:styleId="ListBullet2">
     <w:name w:val="List Bullet 2"/>
     <w:basedOn w:val="Normal"/>
-    <w:rsid w:val="00EC1AC6"/>
+    <w:rsid w:val="006E0994"/>
     <w:pPr>
       <w:numPr>
         <w:numId w:val="53"/>
@@ -32734,7 +33580,7 @@
   <w:style w:type="paragraph" w:customStyle="1" w:styleId="Char">
     <w:name w:val="Char"/>
     <w:basedOn w:val="Normal"/>
-    <w:rsid w:val="00EC1AC6"/>
+    <w:rsid w:val="006E0994"/>
     <w:pPr>
       <w:spacing w:before="0" w:after="160" w:line="240" w:lineRule="exact"/>
     </w:pPr>
@@ -32747,7 +33593,7 @@
   </w:style>
   <w:style w:type="paragraph" w:customStyle="1" w:styleId="Table1Body">
     <w:name w:val="Table1 Body"/>
-    <w:rsid w:val="00EC1AC6"/>
+    <w:rsid w:val="006E0994"/>
     <w:pPr>
       <w:snapToGrid w:val="0"/>
       <w:spacing w:before="60" w:after="60" w:line="240" w:lineRule="auto"/>
@@ -32763,7 +33609,7 @@
     <w:name w:val="Bullet 2 Char"/>
     <w:basedOn w:val="BodyTextChar"/>
     <w:link w:val="Bullet2"/>
-    <w:rsid w:val="00EC1AC6"/>
+    <w:rsid w:val="006E0994"/>
     <w:rPr>
       <w:rFonts w:ascii="Arial Narrow" w:eastAsia="Times New Roman" w:hAnsi="Arial Narrow" w:cs="Times New Roman"/>
       <w:spacing w:val="4"/>
@@ -32777,7 +33623,7 @@
     <w:name w:val="Bullet 1 Char"/>
     <w:basedOn w:val="BodyTextChar"/>
     <w:link w:val="Bullet1"/>
-    <w:rsid w:val="00EC1AC6"/>
+    <w:rsid w:val="006E0994"/>
     <w:rPr>
       <w:rFonts w:ascii="Arial Narrow" w:eastAsia="Times New Roman" w:hAnsi="Arial Narrow" w:cs="Times New Roman"/>
       <w:spacing w:val="4"/>
@@ -32791,7 +33637,7 @@
     <w:name w:val="Bullet 3 Char"/>
     <w:basedOn w:val="BodyTextChar"/>
     <w:link w:val="Bullet3"/>
-    <w:rsid w:val="00EC1AC6"/>
+    <w:rsid w:val="006E0994"/>
     <w:rPr>
       <w:rFonts w:ascii="Arial Narrow" w:eastAsia="Times New Roman" w:hAnsi="Arial Narrow" w:cs="Times New Roman"/>
       <w:spacing w:val="4"/>
@@ -32807,7 +33653,7 @@
     <w:next w:val="CommentText"/>
     <w:link w:val="CommentSubjectChar"/>
     <w:semiHidden/>
-    <w:rsid w:val="00EC1AC6"/>
+    <w:rsid w:val="006E0994"/>
     <w:rPr>
       <w:b/>
       <w:bCs/>
@@ -32832,7 +33678,7 @@
   <w:style w:type="paragraph" w:customStyle="1" w:styleId="CharCharCharChar">
     <w:name w:val="Char Char Char Char"/>
     <w:basedOn w:val="Normal"/>
-    <w:rsid w:val="00EC1AC6"/>
+    <w:rsid w:val="006E0994"/>
     <w:pPr>
       <w:spacing w:before="0" w:after="160" w:line="240" w:lineRule="exact"/>
     </w:pPr>
@@ -32847,7 +33693,7 @@
     <w:name w:val="Body Text 2"/>
     <w:basedOn w:val="Normal"/>
     <w:link w:val="BodyText2Char"/>
-    <w:rsid w:val="00EC1AC6"/>
+    <w:rsid w:val="006E0994"/>
     <w:pPr>
       <w:spacing w:after="120" w:line="480" w:lineRule="auto"/>
     </w:pPr>
@@ -32867,7 +33713,7 @@
   <w:style w:type="paragraph" w:styleId="BlockText">
     <w:name w:val="Block Text"/>
     <w:basedOn w:val="Normal"/>
-    <w:rsid w:val="00EC1AC6"/>
+    <w:rsid w:val="006E0994"/>
     <w:pPr>
       <w:spacing w:after="120"/>
       <w:ind w:left="1440" w:right="1440"/>
@@ -32876,7 +33722,7 @@
   <w:style w:type="paragraph" w:customStyle="1" w:styleId="mynormal">
     <w:name w:val="_my_normal"/>
     <w:basedOn w:val="Normal"/>
-    <w:rsid w:val="00EC1AC6"/>
+    <w:rsid w:val="006E0994"/>
     <w:pPr>
       <w:spacing w:before="0"/>
     </w:pPr>
@@ -32889,7 +33735,7 @@
   <w:style w:type="paragraph" w:customStyle="1" w:styleId="Default">
     <w:name w:val="Default"/>
     <w:link w:val="DefaultChar"/>
-    <w:rsid w:val="00EC1AC6"/>
+    <w:rsid w:val="006E0994"/>
     <w:pPr>
       <w:autoSpaceDE w:val="0"/>
       <w:autoSpaceDN w:val="0"/>
@@ -32908,7 +33754,7 @@
     <w:basedOn w:val="Default"/>
     <w:next w:val="Default"/>
     <w:link w:val="NormalTextChar"/>
-    <w:rsid w:val="00EC1AC6"/>
+    <w:rsid w:val="006E0994"/>
     <w:pPr>
       <w:spacing w:before="120" w:after="120"/>
     </w:pPr>
@@ -32919,7 +33765,7 @@
   <w:style w:type="character" w:customStyle="1" w:styleId="DefaultChar">
     <w:name w:val="Default Char"/>
     <w:link w:val="Default"/>
-    <w:rsid w:val="00EC1AC6"/>
+    <w:rsid w:val="006E0994"/>
     <w:rPr>
       <w:rFonts w:ascii="HHBIIF+Times" w:eastAsia="Times New Roman" w:hAnsi="HHBIIF+Times" w:cs="HHBIIF+Times"/>
       <w:color w:val="000000"/>
@@ -32931,7 +33777,7 @@
     <w:name w:val="Normal Text Char"/>
     <w:basedOn w:val="DefaultChar"/>
     <w:link w:val="NormalText"/>
-    <w:rsid w:val="00EC1AC6"/>
+    <w:rsid w:val="006E0994"/>
     <w:rPr>
       <w:rFonts w:ascii="HHBIIF+Times" w:eastAsia="Times New Roman" w:hAnsi="HHBIIF+Times" w:cs="Times New Roman"/>
       <w:color w:val="000000"/>

</xml_diff>

<commit_message>
docs: add detailed live-demo instructions and slider speech guides for Slide 10 & 11 in speech script
</commit_message>
<xml_diff>
--- a/Seminar/Report.docx
+++ b/Seminar/Report.docx
@@ -6649,15 +6649,7 @@
         <w:spacing w:before="0" w:after="160" w:line="278" w:lineRule="auto"/>
       </w:pPr>
       <w:r>
-        <w:t xml:space="preserve">$EU(A) = </w:t>
-      </w:r>
-      <w:proofErr w:type="gramStart"/>
-      <w:r>
-        <w:t>U(50,000)=</w:t>
-      </w:r>
-      <w:proofErr w:type="gramEnd"/>
-      <w:r>
-        <w:t>50,000≈223.6</w:t>
+        <w:t>$EU(A) = U(50,000)=50,000≈223.6</w:t>
       </w:r>
     </w:p>
     <w:p>
@@ -6669,23 +6661,7 @@
         <w:spacing w:before="0" w:after="160" w:line="278" w:lineRule="auto"/>
       </w:pPr>
       <w:r>
-        <w:t xml:space="preserve">$EU(B) = 0.5 \times </w:t>
-      </w:r>
-      <w:proofErr w:type="gramStart"/>
-      <w:r>
-        <w:t>U(</w:t>
-      </w:r>
-      <w:proofErr w:type="gramEnd"/>
-      <w:r>
-        <w:t xml:space="preserve">$120,000) + 0.5 \times </w:t>
-      </w:r>
-      <w:proofErr w:type="gramStart"/>
-      <w:r>
-        <w:t>U(0)=</w:t>
-      </w:r>
-      <w:proofErr w:type="gramEnd"/>
-      <w:r>
-        <w:t>0.5×120,000+0.5×0≈173.2</w:t>
+        <w:t>$EU(B) = 0.5 \times U($120,000) + 0.5 \times U(0)=0.5×120,000+0.5×0≈173.2</w:t>
       </w:r>
     </w:p>
     <w:p>
@@ -6809,13 +6785,8 @@
         <w:t>Discount Factor:</w:t>
       </w:r>
       <w:r>
-        <w:t> DFt=1(1+</w:t>
-      </w:r>
-      <w:proofErr w:type="gramStart"/>
-      <w:r>
-        <w:t>r)t</w:t>
-      </w:r>
-      <w:proofErr w:type="gramEnd"/>
+        <w:t> DFt=1(1+r)t</w:t>
+      </w:r>
     </w:p>
     <w:p>
       <w:pPr>
@@ -6833,13 +6804,8 @@
         <w:t>Present Value of Benefits (PV_B):</w:t>
       </w:r>
       <w:r>
-        <w:t> PVB=∑t=1nBenefitt(1+</w:t>
-      </w:r>
-      <w:proofErr w:type="gramStart"/>
-      <w:r>
-        <w:t>r)t</w:t>
-      </w:r>
-      <w:proofErr w:type="gramEnd"/>
+        <w:t> PVB=∑t=1nBenefitt(1+r)t</w:t>
+      </w:r>
     </w:p>
     <w:p>
       <w:pPr>
@@ -6857,13 +6823,8 @@
         <w:t>Present Value of Costs (PV_C):</w:t>
       </w:r>
       <w:r>
-        <w:t> PVC=∑t=1nCostt(1+</w:t>
-      </w:r>
-      <w:proofErr w:type="gramStart"/>
-      <w:r>
-        <w:t>r)t</w:t>
-      </w:r>
-      <w:proofErr w:type="gramEnd"/>
+        <w:t> PVC=∑t=1nCostt(1+r)t</w:t>
+      </w:r>
     </w:p>
     <w:p>
       <w:pPr>
@@ -7188,39 +7149,7 @@
           <w:i/>
           <w:iCs/>
         </w:rPr>
-        <w:t>(Note: If calculated using nominal undiscounted ROI, Project B yields $\</w:t>
-      </w:r>
-      <w:proofErr w:type="gramStart"/>
-      <w:r>
-        <w:rPr>
-          <w:i/>
-          <w:iCs/>
-        </w:rPr>
-        <w:t>frac{</w:t>
-      </w:r>
-      <w:proofErr w:type="gramEnd"/>
-      <w:r>
-        <w:rPr>
-          <w:i/>
-          <w:iCs/>
-        </w:rPr>
-        <w:t xml:space="preserve">9000 - </w:t>
-      </w:r>
-      <w:proofErr w:type="gramStart"/>
-      <w:r>
-        <w:rPr>
-          <w:i/>
-          <w:iCs/>
-        </w:rPr>
-        <w:t>6000}{</w:t>
-      </w:r>
-      <w:proofErr w:type="gramEnd"/>
-      <w:r>
-        <w:rPr>
-          <w:i/>
-          <w:iCs/>
-        </w:rPr>
-        <w:t>6000} = 50%$. Project B is the optimal option).</w:t>
+        <w:t>(Note: If calculated using nominal undiscounted ROI, Project B yields $\frac{9000 - 6000}{6000} = 50%$. Project B is the optimal option).</w:t>
       </w:r>
     </w:p>
     <w:p>
@@ -7334,15 +7263,7 @@
         <w:t>Superior Profitability:</w:t>
       </w:r>
       <w:r>
-        <w:t> Project B's NPV ($2,161.34) is almost double that of Project A (1,102.27</w:t>
-      </w:r>
-      <w:proofErr w:type="gramStart"/>
-      <w:r>
-        <w:t>),whileProjectCishighlyunprofitablewithanegativeNPV</w:t>
-      </w:r>
-      <w:proofErr w:type="gramEnd"/>
-      <w:r>
-        <w:t>(-1,343.47$).</w:t>
+        <w:t> Project B's NPV ($2,161.34) is almost double that of Project A (1,102.27),whileProjectCishighlyunprofitablewithanegativeNPV(-1,343.47$).</w:t>
       </w:r>
     </w:p>
     <w:p>
@@ -7723,15 +7644,7 @@
         <w:t>Mitigate:</w:t>
       </w:r>
       <w:r>
-        <w:t xml:space="preserve"> Take proactive actions to reduce the probability or impact of a risk </w:t>
-      </w:r>
-      <w:proofErr w:type="gramStart"/>
-      <w:r>
-        <w:t>below acceptable thresholds</w:t>
-      </w:r>
-      <w:proofErr w:type="gramEnd"/>
-      <w:r>
-        <w:t>.</w:t>
+        <w:t> Take proactive actions to reduce the probability or impact of a risk below acceptable thresholds.</w:t>
       </w:r>
     </w:p>
     <w:p>
@@ -13460,7 +13373,7 @@
     <w:p>
       <w:r>
         <w:pict w14:anchorId="75BD2325">
-          <v:rect id="_x0000_i1031" style="width:0;height:3pt" o:hralign="center" o:hrstd="t" o:hr="t" fillcolor="#a0a0a0" stroked="f"/>
+          <v:rect id="_x0000_i1025" style="width:0;height:3pt" o:hralign="center" o:hrstd="t" o:hr="t" fillcolor="#a0a0a0" stroked="f"/>
         </w:pict>
       </w:r>
     </w:p>
@@ -13670,6 +13583,10 @@
     <w:p>
       <w:pPr>
         <w:pStyle w:val="Heading2"/>
+        <w:numPr>
+          <w:ilvl w:val="0"/>
+          <w:numId w:val="0"/>
+        </w:numPr>
       </w:pPr>
       <w:bookmarkStart w:id="30" w:name="_Toc236148921"/>
       <w:r>
@@ -13969,6 +13886,10 @@
     <w:p>
       <w:pPr>
         <w:pStyle w:val="Heading2"/>
+        <w:numPr>
+          <w:ilvl w:val="0"/>
+          <w:numId w:val="0"/>
+        </w:numPr>
       </w:pPr>
       <w:bookmarkStart w:id="31" w:name="_Toc236148922"/>
       <w:r>
@@ -31521,7 +31442,7 @@
   <w:style w:type="paragraph" w:default="1" w:styleId="Normal">
     <w:name w:val="Normal"/>
     <w:qFormat/>
-    <w:rsid w:val="006E0994"/>
+    <w:rsid w:val="00E547B0"/>
     <w:pPr>
       <w:spacing w:before="120" w:after="0" w:line="240" w:lineRule="auto"/>
     </w:pPr>
@@ -31539,7 +31460,7 @@
     <w:next w:val="BodyText"/>
     <w:link w:val="Heading1Char"/>
     <w:qFormat/>
-    <w:rsid w:val="006E0994"/>
+    <w:rsid w:val="00E547B0"/>
     <w:pPr>
       <w:keepNext/>
       <w:numPr>
@@ -31567,14 +31488,18 @@
     <w:link w:val="Heading2Char"/>
     <w:autoRedefine/>
     <w:qFormat/>
-    <w:rsid w:val="006E0994"/>
+    <w:rsid w:val="00E547B0"/>
     <w:pPr>
       <w:keepNext/>
       <w:numPr>
         <w:ilvl w:val="1"/>
         <w:numId w:val="45"/>
       </w:numPr>
+      <w:tabs>
+        <w:tab w:val="clear" w:pos="576"/>
+      </w:tabs>
       <w:spacing w:before="240" w:after="120"/>
+      <w:ind w:left="0" w:firstLine="0"/>
       <w:outlineLvl w:val="1"/>
     </w:pPr>
     <w:rPr>
@@ -31594,7 +31519,7 @@
     <w:link w:val="Heading3Char"/>
     <w:autoRedefine/>
     <w:qFormat/>
-    <w:rsid w:val="006E0994"/>
+    <w:rsid w:val="00E547B0"/>
     <w:pPr>
       <w:keepNext/>
       <w:numPr>
@@ -31622,7 +31547,7 @@
     <w:link w:val="Heading4Char"/>
     <w:autoRedefine/>
     <w:qFormat/>
-    <w:rsid w:val="006E0994"/>
+    <w:rsid w:val="00E547B0"/>
     <w:pPr>
       <w:numPr>
         <w:ilvl w:val="3"/>
@@ -31650,7 +31575,7 @@
     <w:next w:val="BodyText"/>
     <w:link w:val="Heading5Char"/>
     <w:qFormat/>
-    <w:rsid w:val="006E0994"/>
+    <w:rsid w:val="00E547B0"/>
     <w:pPr>
       <w:keepNext/>
       <w:numPr>
@@ -31678,7 +31603,7 @@
     <w:next w:val="BodyText"/>
     <w:link w:val="Heading6Char"/>
     <w:qFormat/>
-    <w:rsid w:val="006E0994"/>
+    <w:rsid w:val="00E547B0"/>
     <w:pPr>
       <w:keepNext/>
       <w:numPr>
@@ -31705,7 +31630,7 @@
     <w:next w:val="BodyText"/>
     <w:link w:val="Heading7Char"/>
     <w:qFormat/>
-    <w:rsid w:val="006E0994"/>
+    <w:rsid w:val="00E547B0"/>
     <w:pPr>
       <w:keepNext/>
       <w:numPr>
@@ -31731,7 +31656,7 @@
     <w:next w:val="BodyText"/>
     <w:link w:val="Heading8Char"/>
     <w:qFormat/>
-    <w:rsid w:val="006E0994"/>
+    <w:rsid w:val="00E547B0"/>
     <w:pPr>
       <w:keepNext/>
       <w:numPr>
@@ -31757,7 +31682,7 @@
     <w:next w:val="BodyText"/>
     <w:link w:val="Heading9Char"/>
     <w:qFormat/>
-    <w:rsid w:val="006E0994"/>
+    <w:rsid w:val="00E547B0"/>
     <w:pPr>
       <w:keepNext/>
       <w:numPr>
@@ -31779,8 +31704,9 @@
   <w:style w:type="character" w:default="1" w:styleId="DefaultParagraphFont">
     <w:name w:val="Default Paragraph Font"/>
     <w:uiPriority w:val="1"/>
+    <w:semiHidden/>
     <w:unhideWhenUsed/>
-    <w:rsid w:val="006E0994"/>
+    <w:rsid w:val="00E547B0"/>
   </w:style>
   <w:style w:type="table" w:default="1" w:styleId="TableNormal">
     <w:name w:val="Normal Table"/>
@@ -31802,13 +31728,13 @@
     <w:uiPriority w:val="99"/>
     <w:semiHidden/>
     <w:unhideWhenUsed/>
-    <w:rsid w:val="006E0994"/>
+    <w:rsid w:val="00E547B0"/>
   </w:style>
   <w:style w:type="character" w:customStyle="1" w:styleId="Heading1Char">
     <w:name w:val="Heading 1 Char"/>
     <w:aliases w:val="H1 Char"/>
     <w:link w:val="Heading1"/>
-    <w:rsid w:val="006E0994"/>
+    <w:rsid w:val="00E547B0"/>
     <w:rPr>
       <w:rFonts w:ascii="Arial Narrow" w:eastAsia="Times New Roman" w:hAnsi="Arial Narrow" w:cs="Times New Roman"/>
       <w:b/>
@@ -31947,7 +31873,7 @@
     <w:next w:val="Subtitle"/>
     <w:link w:val="TitleChar"/>
     <w:qFormat/>
-    <w:rsid w:val="006E0994"/>
+    <w:rsid w:val="00E547B0"/>
     <w:pPr>
       <w:keepLines w:val="0"/>
       <w:pageBreakBefore/>
@@ -31983,7 +31909,7 @@
     <w:next w:val="BodyText"/>
     <w:link w:val="SubtitleChar"/>
     <w:qFormat/>
-    <w:rsid w:val="006E0994"/>
+    <w:rsid w:val="00E547B0"/>
     <w:pPr>
       <w:spacing w:after="240"/>
     </w:pPr>
@@ -32123,7 +32049,7 @@
   <w:style w:type="character" w:styleId="Hyperlink">
     <w:name w:val="Hyperlink"/>
     <w:uiPriority w:val="99"/>
-    <w:rsid w:val="006E0994"/>
+    <w:rsid w:val="00E547B0"/>
     <w:rPr>
       <w:color w:val="0000FF"/>
       <w:u w:val="single"/>
@@ -32131,7 +32057,7 @@
   </w:style>
   <w:style w:type="character" w:styleId="FollowedHyperlink">
     <w:name w:val="FollowedHyperlink"/>
-    <w:rsid w:val="006E0994"/>
+    <w:rsid w:val="00E547B0"/>
     <w:rPr>
       <w:color w:val="800080"/>
       <w:u w:val="single"/>
@@ -32140,7 +32066,7 @@
   <w:style w:type="character" w:styleId="Strong">
     <w:name w:val="Strong"/>
     <w:qFormat/>
-    <w:rsid w:val="006E0994"/>
+    <w:rsid w:val="00E547B0"/>
     <w:rPr>
       <w:b/>
       <w:bCs/>
@@ -32162,7 +32088,7 @@
   <w:style w:type="character" w:styleId="Emphasis">
     <w:name w:val="Emphasis"/>
     <w:qFormat/>
-    <w:rsid w:val="006E0994"/>
+    <w:rsid w:val="00E547B0"/>
     <w:rPr>
       <w:i/>
     </w:rPr>
@@ -32170,7 +32096,7 @@
   <w:style w:type="paragraph" w:styleId="NormalWeb">
     <w:name w:val="Normal (Web)"/>
     <w:basedOn w:val="Normal"/>
-    <w:rsid w:val="006E0994"/>
+    <w:rsid w:val="00E547B0"/>
     <w:pPr>
       <w:spacing w:before="100" w:beforeAutospacing="1" w:after="100" w:afterAutospacing="1"/>
     </w:pPr>
@@ -32183,7 +32109,7 @@
     <w:name w:val="HTML Preformatted"/>
     <w:basedOn w:val="Normal"/>
     <w:link w:val="HTMLPreformattedChar"/>
-    <w:rsid w:val="006E0994"/>
+    <w:rsid w:val="00E547B0"/>
     <w:pPr>
       <w:tabs>
         <w:tab w:val="left" w:pos="916"/>
@@ -32239,7 +32165,7 @@
   <w:style w:type="paragraph" w:customStyle="1" w:styleId="DocumentTitle">
     <w:name w:val="Document Title"/>
     <w:basedOn w:val="Normal"/>
-    <w:rsid w:val="006E0994"/>
+    <w:rsid w:val="00E547B0"/>
     <w:pPr>
       <w:tabs>
         <w:tab w:val="right" w:pos="8640"/>
@@ -32258,7 +32184,7 @@
   <w:style w:type="paragraph" w:customStyle="1" w:styleId="Tabletext">
     <w:name w:val="Tabletext"/>
     <w:basedOn w:val="Normal"/>
-    <w:rsid w:val="006E0994"/>
+    <w:rsid w:val="00E547B0"/>
     <w:pPr>
       <w:keepLines/>
       <w:widowControl w:val="0"/>
@@ -32271,7 +32197,7 @@
   <w:style w:type="table" w:styleId="TableGrid">
     <w:name w:val="Table Grid"/>
     <w:basedOn w:val="TableNormal"/>
-    <w:rsid w:val="006E0994"/>
+    <w:rsid w:val="00E547B0"/>
     <w:pPr>
       <w:spacing w:after="0" w:line="240" w:lineRule="auto"/>
     </w:pPr>
@@ -32298,7 +32224,7 @@
     <w:aliases w:val="Body Text Plain,Doors Normal"/>
     <w:basedOn w:val="Normal"/>
     <w:link w:val="BodyTextChar"/>
-    <w:rsid w:val="006E0994"/>
+    <w:rsid w:val="00E547B0"/>
     <w:pPr>
       <w:tabs>
         <w:tab w:val="right" w:pos="8640"/>
@@ -32314,7 +32240,7 @@
     <w:name w:val="Body Text Char"/>
     <w:aliases w:val="Body Text Plain Char,Doors Normal Char"/>
     <w:link w:val="BodyText"/>
-    <w:rsid w:val="006E0994"/>
+    <w:rsid w:val="00E547B0"/>
     <w:rPr>
       <w:rFonts w:ascii="Arial Narrow" w:eastAsia="Times New Roman" w:hAnsi="Arial Narrow" w:cs="Times New Roman"/>
       <w:spacing w:val="4"/>
@@ -32327,7 +32253,7 @@
   <w:style w:type="paragraph" w:customStyle="1" w:styleId="Author">
     <w:name w:val="Author"/>
     <w:basedOn w:val="BodyText"/>
-    <w:rsid w:val="006E0994"/>
+    <w:rsid w:val="00E547B0"/>
     <w:pPr>
       <w:spacing w:line="480" w:lineRule="auto"/>
       <w:jc w:val="center"/>
@@ -32336,7 +32262,7 @@
   <w:style w:type="paragraph" w:customStyle="1" w:styleId="BlockQuotation">
     <w:name w:val="Block Quotation"/>
     <w:basedOn w:val="BodyText"/>
-    <w:rsid w:val="006E0994"/>
+    <w:rsid w:val="00E547B0"/>
     <w:pPr>
       <w:keepLines/>
       <w:spacing w:after="160" w:line="480" w:lineRule="auto"/>
@@ -32351,7 +32277,7 @@
     <w:basedOn w:val="Normal"/>
     <w:next w:val="BodyText"/>
     <w:qFormat/>
-    <w:rsid w:val="006E0994"/>
+    <w:rsid w:val="00E547B0"/>
     <w:pPr>
       <w:tabs>
         <w:tab w:val="right" w:pos="8640"/>
@@ -32371,7 +32297,7 @@
     <w:name w:val="Date"/>
     <w:basedOn w:val="BodyText"/>
     <w:link w:val="DateChar"/>
-    <w:rsid w:val="006E0994"/>
+    <w:rsid w:val="00E547B0"/>
     <w:pPr>
       <w:spacing w:after="560"/>
       <w:jc w:val="center"/>
@@ -32394,7 +32320,7 @@
   <w:style w:type="character" w:styleId="EndnoteReference">
     <w:name w:val="endnote reference"/>
     <w:semiHidden/>
-    <w:rsid w:val="006E0994"/>
+    <w:rsid w:val="00E547B0"/>
     <w:rPr>
       <w:vertAlign w:val="superscript"/>
     </w:rPr>
@@ -32403,7 +32329,7 @@
     <w:name w:val="footer"/>
     <w:basedOn w:val="Normal"/>
     <w:link w:val="FooterChar"/>
-    <w:rsid w:val="006E0994"/>
+    <w:rsid w:val="00E547B0"/>
     <w:pPr>
       <w:keepLines/>
       <w:tabs>
@@ -32435,12 +32361,12 @@
   <w:style w:type="paragraph" w:customStyle="1" w:styleId="FooterEven">
     <w:name w:val="Footer Even"/>
     <w:basedOn w:val="Footer"/>
-    <w:rsid w:val="006E0994"/>
+    <w:rsid w:val="00E547B0"/>
   </w:style>
   <w:style w:type="paragraph" w:customStyle="1" w:styleId="FooterFirst">
     <w:name w:val="Footer First"/>
     <w:basedOn w:val="Footer"/>
-    <w:rsid w:val="006E0994"/>
+    <w:rsid w:val="00E547B0"/>
     <w:pPr>
       <w:tabs>
         <w:tab w:val="clear" w:pos="8640"/>
@@ -32450,7 +32376,7 @@
   <w:style w:type="paragraph" w:customStyle="1" w:styleId="FooterOdd">
     <w:name w:val="Footer Odd"/>
     <w:basedOn w:val="Footer"/>
-    <w:rsid w:val="006E0994"/>
+    <w:rsid w:val="00E547B0"/>
     <w:pPr>
       <w:tabs>
         <w:tab w:val="right" w:pos="0"/>
@@ -32460,7 +32386,7 @@
   <w:style w:type="paragraph" w:customStyle="1" w:styleId="FootnoteBase">
     <w:name w:val="Footnote Base"/>
     <w:basedOn w:val="Normal"/>
-    <w:rsid w:val="006E0994"/>
+    <w:rsid w:val="00E547B0"/>
     <w:pPr>
       <w:tabs>
         <w:tab w:val="left" w:pos="187"/>
@@ -32479,7 +32405,7 @@
   <w:style w:type="character" w:styleId="FootnoteReference">
     <w:name w:val="footnote reference"/>
     <w:semiHidden/>
-    <w:rsid w:val="006E0994"/>
+    <w:rsid w:val="00E547B0"/>
     <w:rPr>
       <w:vertAlign w:val="superscript"/>
     </w:rPr>
@@ -32489,7 +32415,7 @@
     <w:basedOn w:val="FootnoteBase"/>
     <w:link w:val="FootnoteTextChar"/>
     <w:semiHidden/>
-    <w:rsid w:val="006E0994"/>
+    <w:rsid w:val="00E547B0"/>
     <w:pPr>
       <w:spacing w:after="120"/>
     </w:pPr>
@@ -32512,7 +32438,7 @@
   <w:style w:type="paragraph" w:customStyle="1" w:styleId="GlossaryDefinition">
     <w:name w:val="Glossary Definition"/>
     <w:basedOn w:val="BodyText"/>
-    <w:rsid w:val="006E0994"/>
+    <w:rsid w:val="00E547B0"/>
     <w:pPr>
       <w:tabs>
         <w:tab w:val="clear" w:pos="8640"/>
@@ -32522,7 +32448,7 @@
   </w:style>
   <w:style w:type="character" w:customStyle="1" w:styleId="GlossaryEntry">
     <w:name w:val="Glossary Entry"/>
-    <w:rsid w:val="006E0994"/>
+    <w:rsid w:val="00E547B0"/>
     <w:rPr>
       <w:b/>
       <w:bCs/>
@@ -32533,7 +32459,7 @@
     <w:name w:val="Heading Base"/>
     <w:basedOn w:val="Normal"/>
     <w:next w:val="BodyText"/>
-    <w:rsid w:val="006E0994"/>
+    <w:rsid w:val="00E547B0"/>
     <w:pPr>
       <w:keepNext/>
       <w:keepLines/>
@@ -32554,7 +32480,7 @@
     <w:basedOn w:val="Normal"/>
     <w:autoRedefine/>
     <w:semiHidden/>
-    <w:rsid w:val="006E0994"/>
+    <w:rsid w:val="00E547B0"/>
     <w:pPr>
       <w:spacing w:before="0"/>
       <w:ind w:left="220" w:hanging="220"/>
@@ -32568,7 +32494,7 @@
     <w:basedOn w:val="Normal"/>
     <w:autoRedefine/>
     <w:semiHidden/>
-    <w:rsid w:val="006E0994"/>
+    <w:rsid w:val="00E547B0"/>
     <w:pPr>
       <w:spacing w:before="0"/>
       <w:ind w:left="440" w:hanging="220"/>
@@ -32582,7 +32508,7 @@
     <w:basedOn w:val="Normal"/>
     <w:autoRedefine/>
     <w:semiHidden/>
-    <w:rsid w:val="006E0994"/>
+    <w:rsid w:val="00E547B0"/>
     <w:pPr>
       <w:spacing w:before="0"/>
       <w:ind w:left="660" w:hanging="220"/>
@@ -32596,7 +32522,7 @@
     <w:basedOn w:val="Normal"/>
     <w:autoRedefine/>
     <w:semiHidden/>
-    <w:rsid w:val="006E0994"/>
+    <w:rsid w:val="00E547B0"/>
     <w:pPr>
       <w:spacing w:before="0"/>
       <w:ind w:left="880" w:hanging="220"/>
@@ -32611,7 +32537,7 @@
     <w:basedOn w:val="Normal"/>
     <w:autoRedefine/>
     <w:semiHidden/>
-    <w:rsid w:val="006E0994"/>
+    <w:rsid w:val="00E547B0"/>
     <w:pPr>
       <w:spacing w:before="0"/>
       <w:ind w:left="1100" w:hanging="220"/>
@@ -32624,7 +32550,7 @@
   <w:style w:type="paragraph" w:customStyle="1" w:styleId="IndexBase">
     <w:name w:val="Index Base"/>
     <w:basedOn w:val="Normal"/>
-    <w:rsid w:val="006E0994"/>
+    <w:rsid w:val="00E547B0"/>
     <w:pPr>
       <w:tabs>
         <w:tab w:val="right" w:leader="dot" w:pos="3960"/>
@@ -32644,7 +32570,7 @@
     <w:next w:val="Index1"/>
     <w:autoRedefine/>
     <w:semiHidden/>
-    <w:rsid w:val="006E0994"/>
+    <w:rsid w:val="00E547B0"/>
     <w:pPr>
       <w:spacing w:before="240" w:after="120"/>
       <w:ind w:left="216"/>
@@ -32658,7 +32584,7 @@
   </w:style>
   <w:style w:type="character" w:customStyle="1" w:styleId="Lead-inEmphasis">
     <w:name w:val="Lead-in Emphasis"/>
-    <w:rsid w:val="006E0994"/>
+    <w:rsid w:val="00E547B0"/>
     <w:rPr>
       <w:rFonts w:ascii="Arial Narrow" w:hAnsi="Arial Narrow"/>
       <w:caps/>
@@ -32667,12 +32593,12 @@
   </w:style>
   <w:style w:type="character" w:styleId="LineNumber">
     <w:name w:val="line number"/>
-    <w:rsid w:val="006E0994"/>
+    <w:rsid w:val="00E547B0"/>
   </w:style>
   <w:style w:type="paragraph" w:styleId="List">
     <w:name w:val="List"/>
     <w:basedOn w:val="BodyText"/>
-    <w:rsid w:val="006E0994"/>
+    <w:rsid w:val="00E547B0"/>
     <w:pPr>
       <w:tabs>
         <w:tab w:val="left" w:pos="720"/>
@@ -32684,7 +32610,7 @@
   <w:style w:type="paragraph" w:styleId="List2">
     <w:name w:val="List 2"/>
     <w:basedOn w:val="List"/>
-    <w:rsid w:val="006E0994"/>
+    <w:rsid w:val="00E547B0"/>
     <w:pPr>
       <w:tabs>
         <w:tab w:val="clear" w:pos="720"/>
@@ -32696,7 +32622,7 @@
   <w:style w:type="paragraph" w:styleId="List3">
     <w:name w:val="List 3"/>
     <w:basedOn w:val="List"/>
-    <w:rsid w:val="006E0994"/>
+    <w:rsid w:val="00E547B0"/>
     <w:pPr>
       <w:tabs>
         <w:tab w:val="clear" w:pos="720"/>
@@ -32708,7 +32634,7 @@
   <w:style w:type="paragraph" w:styleId="List4">
     <w:name w:val="List 4"/>
     <w:basedOn w:val="List"/>
-    <w:rsid w:val="006E0994"/>
+    <w:rsid w:val="00E547B0"/>
     <w:pPr>
       <w:tabs>
         <w:tab w:val="clear" w:pos="720"/>
@@ -32720,7 +32646,7 @@
   <w:style w:type="paragraph" w:styleId="List5">
     <w:name w:val="List 5"/>
     <w:basedOn w:val="List"/>
-    <w:rsid w:val="006E0994"/>
+    <w:rsid w:val="00E547B0"/>
     <w:pPr>
       <w:tabs>
         <w:tab w:val="clear" w:pos="720"/>
@@ -32732,7 +32658,7 @@
   <w:style w:type="paragraph" w:styleId="ListNumber">
     <w:name w:val="List Number"/>
     <w:basedOn w:val="List"/>
-    <w:rsid w:val="006E0994"/>
+    <w:rsid w:val="00E547B0"/>
     <w:pPr>
       <w:tabs>
         <w:tab w:val="clear" w:pos="720"/>
@@ -32746,7 +32672,7 @@
   <w:style w:type="paragraph" w:styleId="ListNumber2">
     <w:name w:val="List Number 2"/>
     <w:basedOn w:val="ListNumber"/>
-    <w:rsid w:val="006E0994"/>
+    <w:rsid w:val="00E547B0"/>
     <w:pPr>
       <w:ind w:left="360"/>
     </w:pPr>
@@ -32754,7 +32680,7 @@
   <w:style w:type="paragraph" w:styleId="ListNumber3">
     <w:name w:val="List Number 3"/>
     <w:basedOn w:val="ListNumber"/>
-    <w:rsid w:val="006E0994"/>
+    <w:rsid w:val="00E547B0"/>
     <w:pPr>
       <w:ind w:left="720"/>
     </w:pPr>
@@ -32762,7 +32688,7 @@
   <w:style w:type="paragraph" w:styleId="ListNumber4">
     <w:name w:val="List Number 4"/>
     <w:basedOn w:val="ListNumber"/>
-    <w:rsid w:val="006E0994"/>
+    <w:rsid w:val="00E547B0"/>
     <w:pPr>
       <w:ind w:left="1080"/>
     </w:pPr>
@@ -32770,7 +32696,7 @@
   <w:style w:type="paragraph" w:styleId="ListNumber5">
     <w:name w:val="List Number 5"/>
     <w:basedOn w:val="ListNumber"/>
-    <w:rsid w:val="006E0994"/>
+    <w:rsid w:val="00E547B0"/>
     <w:pPr>
       <w:ind w:left="1440"/>
     </w:pPr>
@@ -32780,7 +32706,7 @@
     <w:basedOn w:val="BodyText"/>
     <w:link w:val="MacroTextChar"/>
     <w:semiHidden/>
-    <w:rsid w:val="006E0994"/>
+    <w:rsid w:val="00E547B0"/>
     <w:pPr>
       <w:spacing w:after="120"/>
     </w:pPr>
@@ -32806,20 +32732,20 @@
   <w:style w:type="paragraph" w:customStyle="1" w:styleId="Name">
     <w:name w:val="Name"/>
     <w:basedOn w:val="BodyText"/>
-    <w:rsid w:val="006E0994"/>
+    <w:rsid w:val="00E547B0"/>
     <w:pPr>
       <w:jc w:val="center"/>
     </w:pPr>
   </w:style>
   <w:style w:type="character" w:styleId="PageNumber">
     <w:name w:val="page number"/>
-    <w:rsid w:val="006E0994"/>
+    <w:rsid w:val="00E547B0"/>
   </w:style>
   <w:style w:type="paragraph" w:customStyle="1" w:styleId="Picture">
     <w:name w:val="Picture"/>
     <w:basedOn w:val="BodyText"/>
     <w:next w:val="Caption"/>
-    <w:rsid w:val="006E0994"/>
+    <w:rsid w:val="00E547B0"/>
     <w:pPr>
       <w:keepNext/>
       <w:jc w:val="center"/>
@@ -32827,7 +32753,7 @@
   </w:style>
   <w:style w:type="character" w:customStyle="1" w:styleId="Superscript">
     <w:name w:val="Superscript"/>
-    <w:rsid w:val="006E0994"/>
+    <w:rsid w:val="00E547B0"/>
     <w:rPr>
       <w:vertAlign w:val="superscript"/>
     </w:rPr>
@@ -32836,7 +32762,7 @@
     <w:name w:val="table of figures"/>
     <w:basedOn w:val="Normal"/>
     <w:semiHidden/>
-    <w:rsid w:val="006E0994"/>
+    <w:rsid w:val="00E547B0"/>
     <w:pPr>
       <w:tabs>
         <w:tab w:val="right" w:leader="dot" w:pos="8640"/>
@@ -32854,7 +32780,7 @@
     <w:basedOn w:val="Normal"/>
     <w:next w:val="Normal"/>
     <w:semiHidden/>
-    <w:rsid w:val="006E0994"/>
+    <w:rsid w:val="00E547B0"/>
     <w:pPr>
       <w:keepNext/>
       <w:keepLines/>
@@ -32875,7 +32801,7 @@
     <w:basedOn w:val="Normal"/>
     <w:autoRedefine/>
     <w:uiPriority w:val="39"/>
-    <w:rsid w:val="006E0994"/>
+    <w:rsid w:val="00E547B0"/>
     <w:pPr>
       <w:spacing w:after="120"/>
     </w:pPr>
@@ -32893,7 +32819,7 @@
     <w:basedOn w:val="Normal"/>
     <w:autoRedefine/>
     <w:uiPriority w:val="39"/>
-    <w:rsid w:val="006E0994"/>
+    <w:rsid w:val="00E547B0"/>
     <w:pPr>
       <w:spacing w:before="0"/>
       <w:ind w:left="220"/>
@@ -32910,7 +32836,7 @@
     <w:basedOn w:val="Normal"/>
     <w:autoRedefine/>
     <w:uiPriority w:val="39"/>
-    <w:rsid w:val="006E0994"/>
+    <w:rsid w:val="00E547B0"/>
     <w:pPr>
       <w:spacing w:before="0"/>
       <w:ind w:left="440"/>
@@ -32928,7 +32854,7 @@
     <w:basedOn w:val="Normal"/>
     <w:autoRedefine/>
     <w:uiPriority w:val="39"/>
-    <w:rsid w:val="006E0994"/>
+    <w:rsid w:val="00E547B0"/>
     <w:pPr>
       <w:spacing w:before="0"/>
       <w:ind w:left="660"/>
@@ -32944,7 +32870,7 @@
     <w:basedOn w:val="Normal"/>
     <w:autoRedefine/>
     <w:semiHidden/>
-    <w:rsid w:val="006E0994"/>
+    <w:rsid w:val="00E547B0"/>
     <w:pPr>
       <w:spacing w:before="0"/>
       <w:ind w:left="880"/>
@@ -32958,7 +32884,7 @@
   <w:style w:type="paragraph" w:customStyle="1" w:styleId="TOCBase">
     <w:name w:val="TOC Base"/>
     <w:basedOn w:val="Normal"/>
-    <w:rsid w:val="006E0994"/>
+    <w:rsid w:val="00E547B0"/>
     <w:pPr>
       <w:tabs>
         <w:tab w:val="right" w:leader="dot" w:pos="8640"/>
@@ -32974,7 +32900,7 @@
     <w:name w:val="header"/>
     <w:basedOn w:val="Normal"/>
     <w:link w:val="HeaderChar"/>
-    <w:rsid w:val="006E0994"/>
+    <w:rsid w:val="00E547B0"/>
     <w:pPr>
       <w:tabs>
         <w:tab w:val="center" w:pos="4320"/>
@@ -33007,7 +32933,7 @@
     <w:name w:val="Subtitle Cover"/>
     <w:basedOn w:val="TitleCover"/>
     <w:next w:val="BodyText"/>
-    <w:rsid w:val="006E0994"/>
+    <w:rsid w:val="00E547B0"/>
     <w:pPr>
       <w:spacing w:before="240"/>
     </w:pPr>
@@ -33021,7 +32947,7 @@
     <w:name w:val="Title Cover"/>
     <w:basedOn w:val="HeadingBase"/>
     <w:next w:val="SubtitleCover"/>
-    <w:rsid w:val="006E0994"/>
+    <w:rsid w:val="00E547B0"/>
     <w:pPr>
       <w:keepLines w:val="0"/>
       <w:tabs>
@@ -33041,7 +32967,7 @@
     <w:name w:val="Section Label"/>
     <w:basedOn w:val="HeadingBase"/>
     <w:next w:val="BodyText"/>
-    <w:rsid w:val="006E0994"/>
+    <w:rsid w:val="00E547B0"/>
     <w:pPr>
       <w:pageBreakBefore/>
       <w:tabs>
@@ -33060,7 +32986,7 @@
   <w:style w:type="character" w:styleId="CommentReference">
     <w:name w:val="annotation reference"/>
     <w:semiHidden/>
-    <w:rsid w:val="006E0994"/>
+    <w:rsid w:val="00E547B0"/>
     <w:rPr>
       <w:sz w:val="16"/>
       <w:szCs w:val="16"/>
@@ -33071,7 +32997,7 @@
     <w:basedOn w:val="Normal"/>
     <w:link w:val="CommentTextChar"/>
     <w:semiHidden/>
-    <w:rsid w:val="006E0994"/>
+    <w:rsid w:val="00E547B0"/>
     <w:rPr>
       <w:sz w:val="20"/>
       <w:szCs w:val="20"/>
@@ -33094,7 +33020,7 @@
   <w:style w:type="paragraph" w:customStyle="1" w:styleId="Paragraph2">
     <w:name w:val="Paragraph2"/>
     <w:basedOn w:val="Normal"/>
-    <w:rsid w:val="006E0994"/>
+    <w:rsid w:val="00E547B0"/>
     <w:pPr>
       <w:widowControl w:val="0"/>
       <w:spacing w:before="80" w:line="240" w:lineRule="atLeast"/>
@@ -33111,7 +33037,7 @@
   <w:style w:type="paragraph" w:customStyle="1" w:styleId="Paragraph4">
     <w:name w:val="Paragraph4"/>
     <w:basedOn w:val="Normal"/>
-    <w:rsid w:val="006E0994"/>
+    <w:rsid w:val="00E547B0"/>
     <w:pPr>
       <w:widowControl w:val="0"/>
       <w:spacing w:before="80"/>
@@ -33129,7 +33055,7 @@
     <w:next w:val="Normal"/>
     <w:autoRedefine/>
     <w:semiHidden/>
-    <w:rsid w:val="006E0994"/>
+    <w:rsid w:val="00E547B0"/>
     <w:pPr>
       <w:spacing w:before="0"/>
       <w:ind w:left="1100"/>
@@ -33146,7 +33072,7 @@
     <w:next w:val="Normal"/>
     <w:autoRedefine/>
     <w:semiHidden/>
-    <w:rsid w:val="006E0994"/>
+    <w:rsid w:val="00E547B0"/>
     <w:pPr>
       <w:spacing w:before="0"/>
       <w:ind w:left="1320"/>
@@ -33163,7 +33089,7 @@
     <w:next w:val="Normal"/>
     <w:autoRedefine/>
     <w:semiHidden/>
-    <w:rsid w:val="006E0994"/>
+    <w:rsid w:val="00E547B0"/>
     <w:pPr>
       <w:spacing w:before="0"/>
       <w:ind w:left="1540"/>
@@ -33180,7 +33106,7 @@
     <w:next w:val="Normal"/>
     <w:autoRedefine/>
     <w:semiHidden/>
-    <w:rsid w:val="006E0994"/>
+    <w:rsid w:val="00E547B0"/>
     <w:pPr>
       <w:spacing w:before="0"/>
       <w:ind w:left="1760"/>
@@ -33196,7 +33122,7 @@
     <w:basedOn w:val="Normal"/>
     <w:link w:val="DocumentMapChar"/>
     <w:semiHidden/>
-    <w:rsid w:val="006E0994"/>
+    <w:rsid w:val="00E547B0"/>
     <w:pPr>
       <w:shd w:val="clear" w:color="auto" w:fill="000080"/>
     </w:pPr>
@@ -33224,7 +33150,7 @@
     <w:next w:val="Normal"/>
     <w:autoRedefine/>
     <w:semiHidden/>
-    <w:rsid w:val="006E0994"/>
+    <w:rsid w:val="00E547B0"/>
     <w:pPr>
       <w:spacing w:before="0"/>
       <w:ind w:left="1320" w:hanging="220"/>
@@ -33240,7 +33166,7 @@
     <w:next w:val="Normal"/>
     <w:autoRedefine/>
     <w:semiHidden/>
-    <w:rsid w:val="006E0994"/>
+    <w:rsid w:val="00E547B0"/>
     <w:pPr>
       <w:spacing w:before="0"/>
       <w:ind w:left="1540" w:hanging="220"/>
@@ -33256,7 +33182,7 @@
     <w:next w:val="Normal"/>
     <w:autoRedefine/>
     <w:semiHidden/>
-    <w:rsid w:val="006E0994"/>
+    <w:rsid w:val="00E547B0"/>
     <w:pPr>
       <w:spacing w:before="0"/>
       <w:ind w:left="1760" w:hanging="220"/>
@@ -33272,7 +33198,7 @@
     <w:next w:val="Normal"/>
     <w:autoRedefine/>
     <w:semiHidden/>
-    <w:rsid w:val="006E0994"/>
+    <w:rsid w:val="00E547B0"/>
     <w:pPr>
       <w:spacing w:before="0"/>
       <w:ind w:left="1980" w:hanging="220"/>
@@ -33285,7 +33211,7 @@
   <w:style w:type="paragraph" w:customStyle="1" w:styleId="infoblue">
     <w:name w:val="infoblue"/>
     <w:basedOn w:val="Normal"/>
-    <w:rsid w:val="006E0994"/>
+    <w:rsid w:val="00E547B0"/>
     <w:pPr>
       <w:spacing w:before="0" w:after="120" w:line="240" w:lineRule="atLeast"/>
     </w:pPr>
@@ -33303,7 +33229,7 @@
     <w:basedOn w:val="Normal"/>
     <w:next w:val="BodyText"/>
     <w:autoRedefine/>
-    <w:rsid w:val="006E0994"/>
+    <w:rsid w:val="00E547B0"/>
     <w:pPr>
       <w:widowControl w:val="0"/>
     </w:pPr>
@@ -33316,7 +33242,7 @@
   <w:style w:type="paragraph" w:customStyle="1" w:styleId="ParagonSectionLabel">
     <w:name w:val="Paragon Section Label"/>
     <w:basedOn w:val="Normal"/>
-    <w:rsid w:val="006E0994"/>
+    <w:rsid w:val="00E547B0"/>
     <w:pPr>
       <w:spacing w:before="240" w:after="360"/>
       <w:jc w:val="center"/>
@@ -33329,7 +33255,7 @@
   <w:style w:type="paragraph" w:customStyle="1" w:styleId="tableright">
     <w:name w:val="table_right"/>
     <w:basedOn w:val="Normal"/>
-    <w:rsid w:val="006E0994"/>
+    <w:rsid w:val="00E547B0"/>
     <w:pPr>
       <w:spacing w:before="20" w:after="20" w:line="240" w:lineRule="exact"/>
     </w:pPr>
@@ -33342,7 +33268,7 @@
   <w:style w:type="paragraph" w:customStyle="1" w:styleId="numlist">
     <w:name w:val="numlist"/>
     <w:basedOn w:val="Normal"/>
-    <w:rsid w:val="006E0994"/>
+    <w:rsid w:val="00E547B0"/>
     <w:pPr>
       <w:ind w:left="342"/>
     </w:pPr>
@@ -33350,7 +33276,7 @@
   <w:style w:type="paragraph" w:customStyle="1" w:styleId="tablenumlist">
     <w:name w:val="table numlist"/>
     <w:basedOn w:val="Heading1"/>
-    <w:rsid w:val="006E0994"/>
+    <w:rsid w:val="00E547B0"/>
     <w:pPr>
       <w:keepNext w:val="0"/>
       <w:numPr>
@@ -33373,7 +33299,7 @@
   <w:style w:type="paragraph" w:customStyle="1" w:styleId="Normal1">
     <w:name w:val="Normal1"/>
     <w:basedOn w:val="Normal"/>
-    <w:rsid w:val="006E0994"/>
+    <w:rsid w:val="00E547B0"/>
     <w:pPr>
       <w:spacing w:before="60" w:after="120"/>
       <w:ind w:left="720"/>
@@ -33387,7 +33313,7 @@
     <w:name w:val="Bullet 1"/>
     <w:basedOn w:val="BodyText"/>
     <w:link w:val="Bullet1Char"/>
-    <w:rsid w:val="006E0994"/>
+    <w:rsid w:val="00E547B0"/>
     <w:pPr>
       <w:numPr>
         <w:numId w:val="47"/>
@@ -33398,7 +33324,7 @@
     <w:name w:val="Bullet 2"/>
     <w:basedOn w:val="BodyText"/>
     <w:link w:val="Bullet2Char"/>
-    <w:rsid w:val="006E0994"/>
+    <w:rsid w:val="00E547B0"/>
     <w:pPr>
       <w:numPr>
         <w:numId w:val="51"/>
@@ -33409,7 +33335,7 @@
     <w:name w:val="Bullet 3"/>
     <w:basedOn w:val="BodyText"/>
     <w:link w:val="Bullet3Char"/>
-    <w:rsid w:val="006E0994"/>
+    <w:rsid w:val="00E547B0"/>
     <w:pPr>
       <w:numPr>
         <w:numId w:val="49"/>
@@ -33419,7 +33345,7 @@
   <w:style w:type="paragraph" w:customStyle="1" w:styleId="NumberList">
     <w:name w:val="NumberList"/>
     <w:basedOn w:val="Normal"/>
-    <w:rsid w:val="006E0994"/>
+    <w:rsid w:val="00E547B0"/>
     <w:pPr>
       <w:overflowPunct w:val="0"/>
       <w:autoSpaceDE w:val="0"/>
@@ -33438,7 +33364,7 @@
   <w:style w:type="paragraph" w:customStyle="1" w:styleId="Bullet4">
     <w:name w:val="Bullet 4"/>
     <w:basedOn w:val="BodyText"/>
-    <w:rsid w:val="006E0994"/>
+    <w:rsid w:val="00E547B0"/>
     <w:pPr>
       <w:numPr>
         <w:numId w:val="50"/>
@@ -33448,7 +33374,7 @@
   <w:style w:type="paragraph" w:customStyle="1" w:styleId="Bullet5">
     <w:name w:val="Bullet 5"/>
     <w:basedOn w:val="BodyText"/>
-    <w:rsid w:val="006E0994"/>
+    <w:rsid w:val="00E547B0"/>
     <w:pPr>
       <w:numPr>
         <w:numId w:val="48"/>
@@ -33458,7 +33384,7 @@
   <w:style w:type="paragraph" w:customStyle="1" w:styleId="TableContent">
     <w:name w:val="Table Content"/>
     <w:basedOn w:val="BodyText"/>
-    <w:rsid w:val="006E0994"/>
+    <w:rsid w:val="00E547B0"/>
     <w:pPr>
       <w:keepLines/>
       <w:tabs>
@@ -33476,7 +33402,7 @@
   <w:style w:type="paragraph" w:styleId="ListBullet">
     <w:name w:val="List Bullet"/>
     <w:basedOn w:val="Normal"/>
-    <w:rsid w:val="006E0994"/>
+    <w:rsid w:val="00E547B0"/>
     <w:pPr>
       <w:numPr>
         <w:numId w:val="43"/>
@@ -33492,14 +33418,14 @@
     <w:name w:val="term"/>
     <w:basedOn w:val="ListBullet"/>
     <w:next w:val="Normal"/>
-    <w:rsid w:val="006E0994"/>
+    <w:rsid w:val="00E547B0"/>
     <w:pPr>
       <w:spacing w:before="120"/>
     </w:pPr>
   </w:style>
   <w:style w:type="paragraph" w:customStyle="1" w:styleId="list-bullet-level-2">
     <w:name w:val="list-bullet-level-2"/>
-    <w:rsid w:val="006E0994"/>
+    <w:rsid w:val="00E547B0"/>
     <w:pPr>
       <w:numPr>
         <w:numId w:val="52"/>
@@ -33525,7 +33451,7 @@
   <w:style w:type="paragraph" w:customStyle="1" w:styleId="list-bullet-level-2-border">
     <w:name w:val="list-bullet-level-2-border"/>
     <w:basedOn w:val="list-bullet-level-2"/>
-    <w:rsid w:val="006E0994"/>
+    <w:rsid w:val="00E547B0"/>
     <w:pPr>
       <w:keepNext/>
       <w:keepLines/>
@@ -33546,7 +33472,7 @@
     <w:basedOn w:val="Normal"/>
     <w:link w:val="BalloonTextChar"/>
     <w:semiHidden/>
-    <w:rsid w:val="006E0994"/>
+    <w:rsid w:val="00E547B0"/>
     <w:rPr>
       <w:rFonts w:ascii="Tahoma" w:hAnsi="Tahoma" w:cs="Tahoma"/>
       <w:sz w:val="16"/>
@@ -33570,7 +33496,7 @@
   <w:style w:type="paragraph" w:styleId="ListBullet2">
     <w:name w:val="List Bullet 2"/>
     <w:basedOn w:val="Normal"/>
-    <w:rsid w:val="006E0994"/>
+    <w:rsid w:val="00E547B0"/>
     <w:pPr>
       <w:numPr>
         <w:numId w:val="53"/>
@@ -33580,7 +33506,7 @@
   <w:style w:type="paragraph" w:customStyle="1" w:styleId="Char">
     <w:name w:val="Char"/>
     <w:basedOn w:val="Normal"/>
-    <w:rsid w:val="006E0994"/>
+    <w:rsid w:val="00E547B0"/>
     <w:pPr>
       <w:spacing w:before="0" w:after="160" w:line="240" w:lineRule="exact"/>
     </w:pPr>
@@ -33593,7 +33519,7 @@
   </w:style>
   <w:style w:type="paragraph" w:customStyle="1" w:styleId="Table1Body">
     <w:name w:val="Table1 Body"/>
-    <w:rsid w:val="006E0994"/>
+    <w:rsid w:val="00E547B0"/>
     <w:pPr>
       <w:snapToGrid w:val="0"/>
       <w:spacing w:before="60" w:after="60" w:line="240" w:lineRule="auto"/>
@@ -33609,7 +33535,7 @@
     <w:name w:val="Bullet 2 Char"/>
     <w:basedOn w:val="BodyTextChar"/>
     <w:link w:val="Bullet2"/>
-    <w:rsid w:val="006E0994"/>
+    <w:rsid w:val="00E547B0"/>
     <w:rPr>
       <w:rFonts w:ascii="Arial Narrow" w:eastAsia="Times New Roman" w:hAnsi="Arial Narrow" w:cs="Times New Roman"/>
       <w:spacing w:val="4"/>
@@ -33623,7 +33549,7 @@
     <w:name w:val="Bullet 1 Char"/>
     <w:basedOn w:val="BodyTextChar"/>
     <w:link w:val="Bullet1"/>
-    <w:rsid w:val="006E0994"/>
+    <w:rsid w:val="00E547B0"/>
     <w:rPr>
       <w:rFonts w:ascii="Arial Narrow" w:eastAsia="Times New Roman" w:hAnsi="Arial Narrow" w:cs="Times New Roman"/>
       <w:spacing w:val="4"/>
@@ -33637,7 +33563,7 @@
     <w:name w:val="Bullet 3 Char"/>
     <w:basedOn w:val="BodyTextChar"/>
     <w:link w:val="Bullet3"/>
-    <w:rsid w:val="006E0994"/>
+    <w:rsid w:val="00E547B0"/>
     <w:rPr>
       <w:rFonts w:ascii="Arial Narrow" w:eastAsia="Times New Roman" w:hAnsi="Arial Narrow" w:cs="Times New Roman"/>
       <w:spacing w:val="4"/>
@@ -33653,7 +33579,7 @@
     <w:next w:val="CommentText"/>
     <w:link w:val="CommentSubjectChar"/>
     <w:semiHidden/>
-    <w:rsid w:val="006E0994"/>
+    <w:rsid w:val="00E547B0"/>
     <w:rPr>
       <w:b/>
       <w:bCs/>
@@ -33678,7 +33604,7 @@
   <w:style w:type="paragraph" w:customStyle="1" w:styleId="CharCharCharChar">
     <w:name w:val="Char Char Char Char"/>
     <w:basedOn w:val="Normal"/>
-    <w:rsid w:val="006E0994"/>
+    <w:rsid w:val="00E547B0"/>
     <w:pPr>
       <w:spacing w:before="0" w:after="160" w:line="240" w:lineRule="exact"/>
     </w:pPr>
@@ -33693,7 +33619,7 @@
     <w:name w:val="Body Text 2"/>
     <w:basedOn w:val="Normal"/>
     <w:link w:val="BodyText2Char"/>
-    <w:rsid w:val="006E0994"/>
+    <w:rsid w:val="00E547B0"/>
     <w:pPr>
       <w:spacing w:after="120" w:line="480" w:lineRule="auto"/>
     </w:pPr>
@@ -33713,7 +33639,7 @@
   <w:style w:type="paragraph" w:styleId="BlockText">
     <w:name w:val="Block Text"/>
     <w:basedOn w:val="Normal"/>
-    <w:rsid w:val="006E0994"/>
+    <w:rsid w:val="00E547B0"/>
     <w:pPr>
       <w:spacing w:after="120"/>
       <w:ind w:left="1440" w:right="1440"/>
@@ -33722,7 +33648,7 @@
   <w:style w:type="paragraph" w:customStyle="1" w:styleId="mynormal">
     <w:name w:val="_my_normal"/>
     <w:basedOn w:val="Normal"/>
-    <w:rsid w:val="006E0994"/>
+    <w:rsid w:val="00E547B0"/>
     <w:pPr>
       <w:spacing w:before="0"/>
     </w:pPr>
@@ -33735,7 +33661,7 @@
   <w:style w:type="paragraph" w:customStyle="1" w:styleId="Default">
     <w:name w:val="Default"/>
     <w:link w:val="DefaultChar"/>
-    <w:rsid w:val="006E0994"/>
+    <w:rsid w:val="00E547B0"/>
     <w:pPr>
       <w:autoSpaceDE w:val="0"/>
       <w:autoSpaceDN w:val="0"/>
@@ -33754,7 +33680,7 @@
     <w:basedOn w:val="Default"/>
     <w:next w:val="Default"/>
     <w:link w:val="NormalTextChar"/>
-    <w:rsid w:val="006E0994"/>
+    <w:rsid w:val="00E547B0"/>
     <w:pPr>
       <w:spacing w:before="120" w:after="120"/>
     </w:pPr>
@@ -33765,7 +33691,7 @@
   <w:style w:type="character" w:customStyle="1" w:styleId="DefaultChar">
     <w:name w:val="Default Char"/>
     <w:link w:val="Default"/>
-    <w:rsid w:val="006E0994"/>
+    <w:rsid w:val="00E547B0"/>
     <w:rPr>
       <w:rFonts w:ascii="HHBIIF+Times" w:eastAsia="Times New Roman" w:hAnsi="HHBIIF+Times" w:cs="HHBIIF+Times"/>
       <w:color w:val="000000"/>
@@ -33777,7 +33703,7 @@
     <w:name w:val="Normal Text Char"/>
     <w:basedOn w:val="DefaultChar"/>
     <w:link w:val="NormalText"/>
-    <w:rsid w:val="006E0994"/>
+    <w:rsid w:val="00E547B0"/>
     <w:rPr>
       <w:rFonts w:ascii="HHBIIF+Times" w:eastAsia="Times New Roman" w:hAnsi="HHBIIF+Times" w:cs="Times New Roman"/>
       <w:color w:val="000000"/>

</xml_diff>